<commit_message>
reports: add UTM logo, figure captions, conclusions, and align with evaluation requirements
</commit_message>
<xml_diff>
--- a/os-lab2/Lab2_IlieCovali_FAF-243.docx
+++ b/os-lab2/Lab2_IlieCovali_FAF-243.docx
@@ -2,32 +2,35 @@
 <file path=word/document.xml><?xml version="1.0" encoding="utf-8"?>
 <w:document xmlns:w="http://schemas.openxmlformats.org/wordprocessingml/2006/main" xmlns:m="http://schemas.openxmlformats.org/officeDocument/2006/math" xmlns:r="http://schemas.openxmlformats.org/officeDocument/2006/relationships" xmlns:o="urn:schemas-microsoft-com:office:office" xmlns:v="urn:schemas-microsoft-com:vml" xmlns:w10="urn:schemas-microsoft-com:office:word" xmlns:a="http://schemas.openxmlformats.org/drawingml/2006/main" xmlns:pic="http://schemas.openxmlformats.org/drawingml/2006/picture" xmlns:wp="http://schemas.openxmlformats.org/drawingml/2006/wordprocessingDrawing">
   <w:body>
-    <w:bookmarkStart w:id="31" w:name="_c5088a65b4edc3fbc806d552f9be52abc8822c0"/>
     <w:p>
       <w:pPr>
         <w:pStyle w:val="Heading1"/>
       </w:pPr>
+      <w:bookmarkStart w:id="9" w:name="_c5088a65b4edc3fbc806d552f9be52abc8822c0"/>
       <w:r>
         <w:t xml:space="preserve">Operating Systems · FCIM / FAF · UTM · 2026-2027</w:t>
       </w:r>
-    </w:p>
-    <w:bookmarkStart w:id="10" w:name="_34f1bcea86c2f66f16f1907d176d83acb77404a"/>
+      <w:bookmarkEnd w:id="9"/>
+    </w:p>
     <w:p>
       <w:pPr>
         <w:pStyle w:val="Heading2"/>
       </w:pPr>
+      <w:bookmarkStart w:id="10" w:name="_34f1bcea86c2f66f16f1907d176d83acb77404a"/>
       <w:r>
         <w:t xml:space="preserve">Lab 2 · Track B: Meet the OS You Will Build (xv6)</w:t>
       </w:r>
-    </w:p>
-    <w:bookmarkStart w:id="9" w:name="_c48484291e2a833623919f4ee52762c993bb462"/>
+      <w:bookmarkEnd w:id="10"/>
+    </w:p>
     <w:p>
       <w:pPr>
         <w:pStyle w:val="Heading3"/>
       </w:pPr>
-      <w:r>
-        <w:t xml:space="preserve">Environment &amp; Toolchain</w:t>
-      </w:r>
+      <w:bookmarkStart w:id="11" w:name="_e0dd80fa7ae9b37ea1ae2aa784984f58676d942"/>
+      <w:r>
+        <w:t xml:space="preserve">Metadata &amp; Environment</w:t>
+      </w:r>
+      <w:bookmarkEnd w:id="11"/>
     </w:p>
     <w:p>
       <w:pPr>
@@ -42,13 +45,13 @@
           <w:b/>
           <w:bCs/>
         </w:rPr>
-        <w:t xml:space="preserve">Host OS:</w:t>
-      </w:r>
-      <w:r>
-        <w:t xml:space="preserve"> </w:t>
-      </w:r>
-      <w:r>
-        <w:t xml:space="preserve">Linux (CachyOS x86_64, Kernel 7.2.8)</w:t>
+        <w:t xml:space="preserve">Course:</w:t>
+      </w:r>
+      <w:r>
+        <w:t xml:space="preserve"> </w:t>
+      </w:r>
+      <w:r>
+        <w:t xml:space="preserve">Operating Systems, FCIM / FAF, UTM, Academic Year 2026-2027</w:t>
       </w:r>
     </w:p>
     <w:p>
@@ -64,22 +67,13 @@
           <w:b/>
           <w:bCs/>
         </w:rPr>
-        <w:t xml:space="preserve">Target Architecture:</w:t>
-      </w:r>
-      <w:r>
-        <w:t xml:space="preserve"> </w:t>
-      </w:r>
-      <w:r>
-        <w:t xml:space="preserve">RISC-V 64-bit (</w:t>
-      </w:r>
-      <w:r>
-        <w:rPr>
-          <w:rStyle w:val="VerbatimChar"/>
-        </w:rPr>
-        <w:t xml:space="preserve">riscv64-linux-gnu</w:t>
-      </w:r>
-      <w:r>
-        <w:t xml:space="preserve">)</w:t>
+        <w:t xml:space="preserve">Lab Work:</w:t>
+      </w:r>
+      <w:r>
+        <w:t xml:space="preserve"> </w:t>
+      </w:r>
+      <w:r>
+        <w:t xml:space="preserve">Lab 2 (Track B: Meet the OS You Will Build, xv6)</w:t>
       </w:r>
     </w:p>
     <w:p>
@@ -95,22 +89,13 @@
           <w:b/>
           <w:bCs/>
         </w:rPr>
-        <w:t xml:space="preserve">Emulator:</w:t>
-      </w:r>
-      <w:r>
-        <w:t xml:space="preserve"> </w:t>
-      </w:r>
-      <w:r>
-        <w:t xml:space="preserve">QEMU RISC-V System Emulator (</w:t>
-      </w:r>
-      <w:r>
-        <w:rPr>
-          <w:rStyle w:val="VerbatimChar"/>
-        </w:rPr>
-        <w:t xml:space="preserve">qemu-system-riscv</w:t>
-      </w:r>
-      <w:r>
-        <w:t xml:space="preserve">)</w:t>
+        <w:t xml:space="preserve">Author:</w:t>
+      </w:r>
+      <w:r>
+        <w:t xml:space="preserve"> </w:t>
+      </w:r>
+      <w:r>
+        <w:t xml:space="preserve">Ilie Covali (st. gr. FAF-243)</w:t>
       </w:r>
     </w:p>
     <w:p>
@@ -126,6 +111,115 @@
           <w:b/>
           <w:bCs/>
         </w:rPr>
+        <w:t xml:space="preserve">Verified by:</w:t>
+      </w:r>
+      <w:r>
+        <w:t xml:space="preserve"> </w:t>
+      </w:r>
+      <w:r>
+        <w:t xml:space="preserve">Reițman Patricia</w:t>
+      </w:r>
+    </w:p>
+    <w:p>
+      <w:pPr>
+        <w:pStyle w:val="Compact"/>
+        <w:numPr>
+          <w:ilvl w:val="0"/>
+          <w:numId w:val="1001"/>
+        </w:numPr>
+      </w:pPr>
+      <w:r>
+        <w:rPr>
+          <w:b/>
+          <w:bCs/>
+        </w:rPr>
+        <w:t xml:space="preserve">Host OS:</w:t>
+      </w:r>
+      <w:r>
+        <w:t xml:space="preserve"> </w:t>
+      </w:r>
+      <w:r>
+        <w:t xml:space="preserve">Linux (CachyOS x86_64, Kernel 7.2.8-1-cachyos)</w:t>
+      </w:r>
+    </w:p>
+    <w:p>
+      <w:pPr>
+        <w:pStyle w:val="Compact"/>
+        <w:numPr>
+          <w:ilvl w:val="0"/>
+          <w:numId w:val="1001"/>
+        </w:numPr>
+      </w:pPr>
+      <w:r>
+        <w:rPr>
+          <w:b/>
+          <w:bCs/>
+        </w:rPr>
+        <w:t xml:space="preserve">Target Architecture:</w:t>
+      </w:r>
+      <w:r>
+        <w:t xml:space="preserve"> </w:t>
+      </w:r>
+      <w:r>
+        <w:t xml:space="preserve">RISC-V 64-bit (</w:t>
+      </w:r>
+      <w:r>
+        <w:rPr>
+          <w:rStyle w:val="VerbatimChar"/>
+        </w:rPr>
+        <w:t xml:space="preserve">riscv64-linux-gnu</w:t>
+      </w:r>
+      <w:r>
+        <w:t xml:space="preserve">)</w:t>
+      </w:r>
+    </w:p>
+    <w:p>
+      <w:pPr>
+        <w:pStyle w:val="Compact"/>
+        <w:numPr>
+          <w:ilvl w:val="0"/>
+          <w:numId w:val="1001"/>
+        </w:numPr>
+      </w:pPr>
+      <w:r>
+        <w:rPr>
+          <w:b/>
+          <w:bCs/>
+        </w:rPr>
+        <w:t xml:space="preserve">Emulator:</w:t>
+      </w:r>
+      <w:r>
+        <w:t xml:space="preserve"> </w:t>
+      </w:r>
+      <w:r>
+        <w:t xml:space="preserve">QEMU RISC-V System Emulator (</w:t>
+      </w:r>
+      <w:r>
+        <w:rPr>
+          <w:rStyle w:val="VerbatimChar"/>
+        </w:rPr>
+        <w:t xml:space="preserve">qemu-system-riscv64</w:t>
+      </w:r>
+      <w:r>
+        <w:t xml:space="preserve"> </w:t>
+      </w:r>
+      <w:r>
+        <w:t xml:space="preserve">10.1.0)</w:t>
+      </w:r>
+    </w:p>
+    <w:p>
+      <w:pPr>
+        <w:pStyle w:val="Compact"/>
+        <w:numPr>
+          <w:ilvl w:val="0"/>
+          <w:numId w:val="1001"/>
+        </w:numPr>
+      </w:pPr>
+      <w:r>
+        <w:rPr>
+          <w:b/>
+          <w:bCs/>
+        </w:rPr>
         <w:t xml:space="preserve">Toolchain Packages:</w:t>
       </w:r>
       <w:r>
@@ -196,6 +290,46 @@
           <w:rStyle w:val="VerbatimChar"/>
         </w:rPr>
         <w:t xml:space="preserve">riscv64-linux-gnu-binutils</w:t>
+      </w:r>
+    </w:p>
+    <w:p>
+      <w:pPr>
+        <w:pStyle w:val="Compact"/>
+        <w:numPr>
+          <w:ilvl w:val="0"/>
+          <w:numId w:val="1001"/>
+        </w:numPr>
+      </w:pPr>
+      <w:r>
+        <w:rPr>
+          <w:b/>
+          <w:bCs/>
+        </w:rPr>
+        <w:t xml:space="preserve">Workspace:</w:t>
+      </w:r>
+      <w:r>
+        <w:t xml:space="preserve"> </w:t>
+      </w:r>
+      <w:r>
+        <w:rPr>
+          <w:rStyle w:val="VerbatimChar"/>
+        </w:rPr>
+        <w:t xml:space="preserve">/home/ilie/Documents/SO/os-lab2</w:t>
+      </w:r>
+      <w:r>
+        <w:t xml:space="preserve"> </w:t>
+      </w:r>
+      <w:r>
+        <w:t xml:space="preserve">(</w:t>
+      </w:r>
+      <w:r>
+        <w:rPr>
+          <w:rStyle w:val="VerbatimChar"/>
+        </w:rPr>
+        <w:t xml:space="preserve">~/os-lab2</w:t>
+      </w:r>
+      <w:r>
+        <w:t xml:space="preserve">)</w:t>
       </w:r>
     </w:p>
     <w:p>
@@ -205,986 +339,15 @@
         </w:pict>
       </w:r>
     </w:p>
-    <w:bookmarkEnd w:id="9"/>
-    <w:bookmarkEnd w:id="10"/>
-    <w:bookmarkStart w:id="13" w:name="_6d272b69cc374da6539b6ce1d36f9703dfd49f3"/>
     <w:p>
       <w:pPr>
         <w:pStyle w:val="Heading2"/>
       </w:pPr>
-      <w:r>
-        <w:t xml:space="preserve">Part 1. Build It and Boot It</w:t>
-      </w:r>
-    </w:p>
-    <w:bookmarkStart w:id="11" w:name="_c3067736b3415a7ad5e31df7e09d73c6406016b"/>
-    <w:p>
-      <w:pPr>
-        <w:pStyle w:val="Heading3"/>
-      </w:pPr>
-      <w:r>
-        <w:t xml:space="preserve">1. Compiling and Launching xv6</w:t>
-      </w:r>
-    </w:p>
-    <w:p>
-      <w:pPr>
-        <w:pStyle w:val="FirstParagraph"/>
-      </w:pPr>
-      <w:r>
-        <w:t xml:space="preserve">To compile the kernel, bootstrap loader, and user-space utilities, and then launch them under QEMU:</w:t>
-      </w:r>
-    </w:p>
-    <w:p>
-      <w:pPr>
-        <w:pStyle w:val="SourceCode"/>
-      </w:pPr>
-      <w:r>
-        <w:rPr>
-          <w:rStyle w:val="ExtensionTok"/>
-        </w:rPr>
-        <w:t xml:space="preserve">❯</w:t>
-      </w:r>
-      <w:r>
-        <w:rPr>
-          <w:rStyle w:val="NormalTok"/>
-        </w:rPr>
-        <w:t xml:space="preserve"> make qemu</w:t>
-      </w:r>
-      <w:r>
-        <w:br/>
-      </w:r>
-      <w:r>
-        <w:rPr>
-          <w:rStyle w:val="ExtensionTok"/>
-        </w:rPr>
-        <w:t xml:space="preserve">qemu-system-riscv64</w:t>
-      </w:r>
-      <w:r>
-        <w:rPr>
-          <w:rStyle w:val="NormalTok"/>
-        </w:rPr>
-        <w:t xml:space="preserve"> </w:t>
-      </w:r>
-      <w:r>
-        <w:rPr>
-          <w:rStyle w:val="AttributeTok"/>
-        </w:rPr>
-        <w:t xml:space="preserve">-machine</w:t>
-      </w:r>
-      <w:r>
-        <w:rPr>
-          <w:rStyle w:val="NormalTok"/>
-        </w:rPr>
-        <w:t xml:space="preserve"> virt </w:t>
-      </w:r>
-      <w:r>
-        <w:rPr>
-          <w:rStyle w:val="AttributeTok"/>
-        </w:rPr>
-        <w:t xml:space="preserve">-bios</w:t>
-      </w:r>
-      <w:r>
-        <w:rPr>
-          <w:rStyle w:val="NormalTok"/>
-        </w:rPr>
-        <w:t xml:space="preserve"> none </w:t>
-      </w:r>
-      <w:r>
-        <w:rPr>
-          <w:rStyle w:val="AttributeTok"/>
-        </w:rPr>
-        <w:t xml:space="preserve">-kernel</w:t>
-      </w:r>
-      <w:r>
-        <w:rPr>
-          <w:rStyle w:val="NormalTok"/>
-        </w:rPr>
-        <w:t xml:space="preserve"> kernel/kernel </w:t>
-      </w:r>
-      <w:r>
-        <w:rPr>
-          <w:rStyle w:val="AttributeTok"/>
-        </w:rPr>
-        <w:t xml:space="preserve">-m</w:t>
-      </w:r>
-      <w:r>
-        <w:rPr>
-          <w:rStyle w:val="NormalTok"/>
-        </w:rPr>
-        <w:t xml:space="preserve"> 128M </w:t>
-      </w:r>
-      <w:r>
-        <w:rPr>
-          <w:rStyle w:val="AttributeTok"/>
-        </w:rPr>
-        <w:t xml:space="preserve">-smp</w:t>
-      </w:r>
-      <w:r>
-        <w:rPr>
-          <w:rStyle w:val="NormalTok"/>
-        </w:rPr>
-        <w:t xml:space="preserve"> 3 </w:t>
-      </w:r>
-      <w:r>
-        <w:rPr>
-          <w:rStyle w:val="AttributeTok"/>
-        </w:rPr>
-        <w:t xml:space="preserve">-nographic</w:t>
-      </w:r>
-      <w:r>
-        <w:rPr>
-          <w:rStyle w:val="NormalTok"/>
-        </w:rPr>
-        <w:t xml:space="preserve"> </w:t>
-      </w:r>
-      <w:r>
-        <w:rPr>
-          <w:rStyle w:val="AttributeTok"/>
-        </w:rPr>
-        <w:t xml:space="preserve">-drive</w:t>
-      </w:r>
-      <w:r>
-        <w:rPr>
-          <w:rStyle w:val="NormalTok"/>
-        </w:rPr>
-        <w:t xml:space="preserve"> file=fs.img,if=none,format=raw,id=x0 </w:t>
-      </w:r>
-      <w:r>
-        <w:rPr>
-          <w:rStyle w:val="AttributeTok"/>
-        </w:rPr>
-        <w:t xml:space="preserve">-device</w:t>
-      </w:r>
-      <w:r>
-        <w:rPr>
-          <w:rStyle w:val="NormalTok"/>
-        </w:rPr>
-        <w:t xml:space="preserve"> virtio-blk-device,drive=x0,bus=virtio-mmio-bus.0</w:t>
-      </w:r>
-      <w:r>
-        <w:br/>
-      </w:r>
-      <w:r>
-        <w:br/>
-      </w:r>
-      <w:r>
-        <w:rPr>
-          <w:rStyle w:val="ExtensionTok"/>
-        </w:rPr>
-        <w:t xml:space="preserve">xv6</w:t>
-      </w:r>
-      <w:r>
-        <w:rPr>
-          <w:rStyle w:val="NormalTok"/>
-        </w:rPr>
-        <w:t xml:space="preserve"> kernel is booting</w:t>
-      </w:r>
-      <w:r>
-        <w:br/>
-      </w:r>
-      <w:r>
-        <w:br/>
-      </w:r>
-      <w:r>
-        <w:rPr>
-          <w:rStyle w:val="ExtensionTok"/>
-        </w:rPr>
-        <w:t xml:space="preserve">hart</w:t>
-      </w:r>
-      <w:r>
-        <w:rPr>
-          <w:rStyle w:val="NormalTok"/>
-        </w:rPr>
-        <w:t xml:space="preserve"> 2 starting</w:t>
-      </w:r>
-      <w:r>
-        <w:br/>
-      </w:r>
-      <w:r>
-        <w:rPr>
-          <w:rStyle w:val="ExtensionTok"/>
-        </w:rPr>
-        <w:t xml:space="preserve">hart</w:t>
-      </w:r>
-      <w:r>
-        <w:rPr>
-          <w:rStyle w:val="NormalTok"/>
-        </w:rPr>
-        <w:t xml:space="preserve"> 1 starting</w:t>
-      </w:r>
-      <w:r>
-        <w:br/>
-      </w:r>
-      <w:r>
-        <w:rPr>
-          <w:rStyle w:val="ExtensionTok"/>
-        </w:rPr>
-        <w:t xml:space="preserve">init:</w:t>
-      </w:r>
-      <w:r>
-        <w:rPr>
-          <w:rStyle w:val="NormalTok"/>
-        </w:rPr>
-        <w:t xml:space="preserve"> starting sh</w:t>
-      </w:r>
-      <w:r>
-        <w:br/>
-      </w:r>
-      <w:r>
-        <w:rPr>
-          <w:rStyle w:val="ExtensionTok"/>
-        </w:rPr>
-        <w:t xml:space="preserve">$</w:t>
-      </w:r>
-      <w:r>
-        <w:rPr>
-          <w:rStyle w:val="NormalTok"/>
-        </w:rPr>
-        <w:t xml:space="preserve"> </w:t>
-      </w:r>
-    </w:p>
-    <w:bookmarkEnd w:id="11"/>
-    <w:bookmarkStart w:id="12" w:name="_0ef0bc1860ff7be9ef71eade4df7db8739ddac3"/>
-    <w:p>
-      <w:pPr>
-        <w:pStyle w:val="Heading3"/>
-      </w:pPr>
-      <w:r>
-        <w:t xml:space="preserve">2. Exiting QEMU</w:t>
-      </w:r>
-    </w:p>
-    <w:p>
-      <w:pPr>
-        <w:pStyle w:val="FirstParagraph"/>
-      </w:pPr>
-      <w:r>
-        <w:t xml:space="preserve">xv6 executes inside the QEMU hardware emulator. To quit and return to the host terminal:</w:t>
-      </w:r>
-      <w:r>
-        <w:t xml:space="preserve"> </w:t>
-      </w:r>
-      <w:r>
-        <w:t xml:space="preserve">- Press</w:t>
-      </w:r>
-      <w:r>
-        <w:t xml:space="preserve"> </w:t>
-      </w:r>
-      <w:r>
-        <w:rPr>
-          <w:rStyle w:val="VerbatimChar"/>
-        </w:rPr>
-        <w:t xml:space="preserve">Ctrl-A</w:t>
-      </w:r>
-      <w:r>
-        <w:t xml:space="preserve">, release, then press</w:t>
-      </w:r>
-      <w:r>
-        <w:t xml:space="preserve"> </w:t>
-      </w:r>
-      <w:r>
-        <w:rPr>
-          <w:rStyle w:val="VerbatimChar"/>
-        </w:rPr>
-        <w:t xml:space="preserve">X</w:t>
-      </w:r>
-      <w:r>
-        <w:t xml:space="preserve">.</w:t>
-      </w:r>
-    </w:p>
-    <w:p>
-      <w:r>
-        <w:pict>
-          <v:rect style="width:0;height:1.5pt" o:hralign="center" o:hrstd="t" o:hr="t"/>
-        </w:pict>
-      </w:r>
-    </w:p>
-    <w:bookmarkEnd w:id="12"/>
-    <w:bookmarkEnd w:id="13"/>
-    <w:bookmarkStart w:id="16" w:name="_efc1f70556d64650caadec06f9b3ad72587a3cc"/>
-    <w:p>
-      <w:pPr>
-        <w:pStyle w:val="Heading2"/>
-      </w:pPr>
-      <w:r>
-        <w:t xml:space="preserve">Part 2. Use xv6 as the Unix It Is</w:t>
-      </w:r>
-    </w:p>
-    <w:bookmarkStart w:id="14" w:name="_ac6671fb0000910ab4427d75e73a1c35d8d6834"/>
-    <w:p>
-      <w:pPr>
-        <w:pStyle w:val="Heading3"/>
-      </w:pPr>
-      <w:r>
-        <w:t xml:space="preserve">Commands Tested Inside xv6</w:t>
-      </w:r>
-    </w:p>
-    <w:p>
-      <w:pPr>
-        <w:pStyle w:val="SourceCode"/>
-      </w:pPr>
-      <w:r>
-        <w:rPr>
-          <w:rStyle w:val="ExtensionTok"/>
-        </w:rPr>
-        <w:t xml:space="preserve">$</w:t>
-      </w:r>
-      <w:r>
-        <w:rPr>
-          <w:rStyle w:val="NormalTok"/>
-        </w:rPr>
-        <w:t xml:space="preserve"> ls</w:t>
-      </w:r>
-      <w:r>
-        <w:br/>
-      </w:r>
-      <w:r>
-        <w:rPr>
-          <w:rStyle w:val="BuiltInTok"/>
-        </w:rPr>
-        <w:t xml:space="preserve">.</w:t>
-      </w:r>
-      <w:r>
-        <w:rPr>
-          <w:rStyle w:val="NormalTok"/>
-        </w:rPr>
-        <w:t xml:space="preserve">              1 1 1024</w:t>
-      </w:r>
-      <w:r>
-        <w:br/>
-      </w:r>
-      <w:r>
-        <w:rPr>
-          <w:rStyle w:val="ExtensionTok"/>
-        </w:rPr>
-        <w:t xml:space="preserve">..</w:t>
-      </w:r>
-      <w:r>
-        <w:rPr>
-          <w:rStyle w:val="NormalTok"/>
-        </w:rPr>
-        <w:t xml:space="preserve">             1 1 1024</w:t>
-      </w:r>
-      <w:r>
-        <w:br/>
-      </w:r>
-      <w:r>
-        <w:rPr>
-          <w:rStyle w:val="ExtensionTok"/>
-        </w:rPr>
-        <w:t xml:space="preserve">README</w:t>
-      </w:r>
-      <w:r>
-        <w:rPr>
-          <w:rStyle w:val="NormalTok"/>
-        </w:rPr>
-        <w:t xml:space="preserve">         2 2 2441</w:t>
-      </w:r>
-      <w:r>
-        <w:br/>
-      </w:r>
-      <w:r>
-        <w:rPr>
-          <w:rStyle w:val="FunctionTok"/>
-        </w:rPr>
-        <w:t xml:space="preserve">cat</w:t>
-      </w:r>
-      <w:r>
-        <w:rPr>
-          <w:rStyle w:val="NormalTok"/>
-        </w:rPr>
-        <w:t xml:space="preserve">            2 3 32800</w:t>
-      </w:r>
-      <w:r>
-        <w:br/>
-      </w:r>
-      <w:r>
-        <w:rPr>
-          <w:rStyle w:val="BuiltInTok"/>
-        </w:rPr>
-        <w:t xml:space="preserve">echo</w:t>
-      </w:r>
-      <w:r>
-        <w:rPr>
-          <w:rStyle w:val="NormalTok"/>
-        </w:rPr>
-        <w:t xml:space="preserve">           2 4 31696</w:t>
-      </w:r>
-      <w:r>
-        <w:br/>
-      </w:r>
-      <w:r>
-        <w:rPr>
-          <w:rStyle w:val="ExtensionTok"/>
-        </w:rPr>
-        <w:t xml:space="preserve">forktest</w:t>
-      </w:r>
-      <w:r>
-        <w:rPr>
-          <w:rStyle w:val="NormalTok"/>
-        </w:rPr>
-        <w:t xml:space="preserve">       2 5 15856</w:t>
-      </w:r>
-      <w:r>
-        <w:br/>
-      </w:r>
-      <w:r>
-        <w:rPr>
-          <w:rStyle w:val="FunctionTok"/>
-        </w:rPr>
-        <w:t xml:space="preserve">grep</w:t>
-      </w:r>
-      <w:r>
-        <w:rPr>
-          <w:rStyle w:val="NormalTok"/>
-        </w:rPr>
-        <w:t xml:space="preserve">           2 6 36248</w:t>
-      </w:r>
-      <w:r>
-        <w:br/>
-      </w:r>
-      <w:r>
-        <w:rPr>
-          <w:rStyle w:val="ExtensionTok"/>
-        </w:rPr>
-        <w:t xml:space="preserve">init</w:t>
-      </w:r>
-      <w:r>
-        <w:rPr>
-          <w:rStyle w:val="NormalTok"/>
-        </w:rPr>
-        <w:t xml:space="preserve">           2 7 32176</w:t>
-      </w:r>
-      <w:r>
-        <w:br/>
-      </w:r>
-      <w:r>
-        <w:rPr>
-          <w:rStyle w:val="BuiltInTok"/>
-        </w:rPr>
-        <w:t xml:space="preserve">kill</w:t>
-      </w:r>
-      <w:r>
-        <w:rPr>
-          <w:rStyle w:val="NormalTok"/>
-        </w:rPr>
-        <w:t xml:space="preserve">           2 8 31568</w:t>
-      </w:r>
-      <w:r>
-        <w:br/>
-      </w:r>
-      <w:r>
-        <w:rPr>
-          <w:rStyle w:val="FunctionTok"/>
-        </w:rPr>
-        <w:t xml:space="preserve">ln</w:t>
-      </w:r>
-      <w:r>
-        <w:rPr>
-          <w:rStyle w:val="NormalTok"/>
-        </w:rPr>
-        <w:t xml:space="preserve">             2 9 31448</w:t>
-      </w:r>
-      <w:r>
-        <w:br/>
-      </w:r>
-      <w:r>
-        <w:rPr>
-          <w:rStyle w:val="FunctionTok"/>
-        </w:rPr>
-        <w:t xml:space="preserve">ls</w:t>
-      </w:r>
-      <w:r>
-        <w:rPr>
-          <w:rStyle w:val="NormalTok"/>
-        </w:rPr>
-        <w:t xml:space="preserve">             2 10 35056</w:t>
-      </w:r>
-      <w:r>
-        <w:br/>
-      </w:r>
-      <w:r>
-        <w:rPr>
-          <w:rStyle w:val="FunctionTok"/>
-        </w:rPr>
-        <w:t xml:space="preserve">mkdir</w:t>
-      </w:r>
-      <w:r>
-        <w:rPr>
-          <w:rStyle w:val="NormalTok"/>
-        </w:rPr>
-        <w:t xml:space="preserve">          2 11 31664</w:t>
-      </w:r>
-      <w:r>
-        <w:br/>
-      </w:r>
-      <w:r>
-        <w:rPr>
-          <w:rStyle w:val="FunctionTok"/>
-        </w:rPr>
-        <w:t xml:space="preserve">rm</w:t>
-      </w:r>
-      <w:r>
-        <w:rPr>
-          <w:rStyle w:val="NormalTok"/>
-        </w:rPr>
-        <w:t xml:space="preserve">             2 12 31648</w:t>
-      </w:r>
-      <w:r>
-        <w:br/>
-      </w:r>
-      <w:r>
-        <w:rPr>
-          <w:rStyle w:val="FunctionTok"/>
-        </w:rPr>
-        <w:t xml:space="preserve">sh</w:t>
-      </w:r>
-      <w:r>
-        <w:rPr>
-          <w:rStyle w:val="NormalTok"/>
-        </w:rPr>
-        <w:t xml:space="preserve">             2 13 54088</w:t>
-      </w:r>
-      <w:r>
-        <w:br/>
-      </w:r>
-      <w:r>
-        <w:rPr>
-          <w:rStyle w:val="ExtensionTok"/>
-        </w:rPr>
-        <w:t xml:space="preserve">stressfs</w:t>
-      </w:r>
-      <w:r>
-        <w:rPr>
-          <w:rStyle w:val="NormalTok"/>
-        </w:rPr>
-        <w:t xml:space="preserve">       2 14 32544</w:t>
-      </w:r>
-      <w:r>
-        <w:br/>
-      </w:r>
-      <w:r>
-        <w:rPr>
-          <w:rStyle w:val="ExtensionTok"/>
-        </w:rPr>
-        <w:t xml:space="preserve">usertests</w:t>
-      </w:r>
-      <w:r>
-        <w:rPr>
-          <w:rStyle w:val="NormalTok"/>
-        </w:rPr>
-        <w:t xml:space="preserve">      2 15 178872</w:t>
-      </w:r>
-      <w:r>
-        <w:br/>
-      </w:r>
-      <w:r>
-        <w:rPr>
-          <w:rStyle w:val="ExtensionTok"/>
-        </w:rPr>
-        <w:t xml:space="preserve">grind</w:t>
-      </w:r>
-      <w:r>
-        <w:rPr>
-          <w:rStyle w:val="NormalTok"/>
-        </w:rPr>
-        <w:t xml:space="preserve">          2 16 47688</w:t>
-      </w:r>
-      <w:r>
-        <w:br/>
-      </w:r>
-      <w:r>
-        <w:rPr>
-          <w:rStyle w:val="FunctionTok"/>
-        </w:rPr>
-        <w:t xml:space="preserve">wc</w:t>
-      </w:r>
-      <w:r>
-        <w:rPr>
-          <w:rStyle w:val="NormalTok"/>
-        </w:rPr>
-        <w:t xml:space="preserve">             2 17 33496</w:t>
-      </w:r>
-      <w:r>
-        <w:br/>
-      </w:r>
-      <w:r>
-        <w:rPr>
-          <w:rStyle w:val="ExtensionTok"/>
-        </w:rPr>
-        <w:t xml:space="preserve">zombie</w:t>
-      </w:r>
-      <w:r>
-        <w:rPr>
-          <w:rStyle w:val="NormalTok"/>
-        </w:rPr>
-        <w:t xml:space="preserve">         2 18 31032</w:t>
-      </w:r>
-      <w:r>
-        <w:br/>
-      </w:r>
-      <w:r>
-        <w:rPr>
-          <w:rStyle w:val="ExtensionTok"/>
-        </w:rPr>
-        <w:t xml:space="preserve">logstress</w:t>
-      </w:r>
-      <w:r>
-        <w:rPr>
-          <w:rStyle w:val="NormalTok"/>
-        </w:rPr>
-        <w:t xml:space="preserve">      2 19 33544</w:t>
-      </w:r>
-      <w:r>
-        <w:br/>
-      </w:r>
-      <w:r>
-        <w:rPr>
-          <w:rStyle w:val="ExtensionTok"/>
-        </w:rPr>
-        <w:t xml:space="preserve">forphan</w:t>
-      </w:r>
-      <w:r>
-        <w:rPr>
-          <w:rStyle w:val="NormalTok"/>
-        </w:rPr>
-        <w:t xml:space="preserve">        2 20 31736</w:t>
-      </w:r>
-      <w:r>
-        <w:br/>
-      </w:r>
-      <w:r>
-        <w:rPr>
-          <w:rStyle w:val="ExtensionTok"/>
-        </w:rPr>
-        <w:t xml:space="preserve">dorphan</w:t>
-      </w:r>
-      <w:r>
-        <w:rPr>
-          <w:rStyle w:val="NormalTok"/>
-        </w:rPr>
-        <w:t xml:space="preserve">        2 21 31600</w:t>
-      </w:r>
-      <w:r>
-        <w:br/>
-      </w:r>
-      <w:r>
-        <w:rPr>
-          <w:rStyle w:val="FunctionTok"/>
-        </w:rPr>
-        <w:t xml:space="preserve">sync</w:t>
-      </w:r>
-      <w:r>
-        <w:rPr>
-          <w:rStyle w:val="NormalTok"/>
-        </w:rPr>
-        <w:t xml:space="preserve">           2 22 31104</w:t>
-      </w:r>
-      <w:r>
-        <w:br/>
-      </w:r>
-      <w:r>
-        <w:rPr>
-          <w:rStyle w:val="ExtensionTok"/>
-        </w:rPr>
-        <w:t xml:space="preserve">console</w:t>
-      </w:r>
-      <w:r>
-        <w:rPr>
-          <w:rStyle w:val="NormalTok"/>
-        </w:rPr>
-        <w:t xml:space="preserve">        3 23 0</w:t>
-      </w:r>
-      <w:r>
-        <w:br/>
-      </w:r>
-      <w:r>
-        <w:br/>
-      </w:r>
-      <w:r>
-        <w:rPr>
-          <w:rStyle w:val="ExtensionTok"/>
-        </w:rPr>
-        <w:t xml:space="preserve">$</w:t>
-      </w:r>
-      <w:r>
-        <w:rPr>
-          <w:rStyle w:val="NormalTok"/>
-        </w:rPr>
-        <w:t xml:space="preserve"> cat README</w:t>
-      </w:r>
-      <w:r>
-        <w:br/>
-      </w:r>
-      <w:r>
-        <w:rPr>
-          <w:rStyle w:val="ExtensionTok"/>
-        </w:rPr>
-        <w:t xml:space="preserve">xv6</w:t>
-      </w:r>
-      <w:r>
-        <w:rPr>
-          <w:rStyle w:val="NormalTok"/>
-        </w:rPr>
-        <w:t xml:space="preserve"> is a re-implementation of Dennis Ritchie</w:t>
-      </w:r>
-      <w:r>
-        <w:rPr>
-          <w:rStyle w:val="StringTok"/>
-        </w:rPr>
-        <w:t xml:space="preserve">'s and Ken Thompson'</w:t>
-      </w:r>
-      <w:r>
-        <w:rPr>
-          <w:rStyle w:val="NormalTok"/>
-        </w:rPr>
-        <w:t xml:space="preserve">s Unix</w:t>
-      </w:r>
-      <w:r>
-        <w:br/>
-      </w:r>
-      <w:r>
-        <w:rPr>
-          <w:rStyle w:val="ExtensionTok"/>
-        </w:rPr>
-        <w:t xml:space="preserve">Version</w:t>
-      </w:r>
-      <w:r>
-        <w:rPr>
-          <w:rStyle w:val="NormalTok"/>
-        </w:rPr>
-        <w:t xml:space="preserve"> 6 </w:t>
-      </w:r>
-      <w:r>
-        <w:rPr>
-          <w:rStyle w:val="ErrorTok"/>
-        </w:rPr>
-        <w:t xml:space="preserve">(</w:t>
-      </w:r>
-      <w:r>
-        <w:rPr>
-          <w:rStyle w:val="ExtensionTok"/>
-        </w:rPr>
-        <w:t xml:space="preserve">v6</w:t>
-      </w:r>
-      <w:r>
-        <w:rPr>
-          <w:rStyle w:val="KeywordTok"/>
-        </w:rPr>
-        <w:t xml:space="preserve">)</w:t>
-      </w:r>
-      <w:r>
-        <w:rPr>
-          <w:rStyle w:val="BuiltInTok"/>
-        </w:rPr>
-        <w:t xml:space="preserve">.</w:t>
-      </w:r>
-      <w:r>
-        <w:rPr>
-          <w:rStyle w:val="NormalTok"/>
-        </w:rPr>
-        <w:t xml:space="preserve">  xv6 loosely follows the structure and style of v6,</w:t>
-      </w:r>
-      <w:r>
-        <w:br/>
-      </w:r>
-      <w:r>
-        <w:rPr>
-          <w:rStyle w:val="ExtensionTok"/>
-        </w:rPr>
-        <w:t xml:space="preserve">but</w:t>
-      </w:r>
-      <w:r>
-        <w:rPr>
-          <w:rStyle w:val="NormalTok"/>
-        </w:rPr>
-        <w:t xml:space="preserve"> is implemented for a modern RISC-V multiprocessor using ANSI C.</w:t>
-      </w:r>
-      <w:r>
-        <w:br/>
-      </w:r>
-      <w:r>
-        <w:rPr>
-          <w:rStyle w:val="ExtensionTok"/>
-        </w:rPr>
-        <w:t xml:space="preserve">...</w:t>
-      </w:r>
-      <w:r>
-        <w:br/>
-      </w:r>
-      <w:r>
-        <w:br/>
-      </w:r>
-      <w:r>
-        <w:rPr>
-          <w:rStyle w:val="ExtensionTok"/>
-        </w:rPr>
-        <w:t xml:space="preserve">$</w:t>
-      </w:r>
-      <w:r>
-        <w:rPr>
-          <w:rStyle w:val="NormalTok"/>
-        </w:rPr>
-        <w:t xml:space="preserve"> echo hello xv6</w:t>
-      </w:r>
-      <w:r>
-        <w:br/>
-      </w:r>
-      <w:r>
-        <w:rPr>
-          <w:rStyle w:val="ExtensionTok"/>
-        </w:rPr>
-        <w:t xml:space="preserve">hello</w:t>
-      </w:r>
-      <w:r>
-        <w:rPr>
-          <w:rStyle w:val="NormalTok"/>
-        </w:rPr>
-        <w:t xml:space="preserve"> xv6</w:t>
-      </w:r>
-      <w:r>
-        <w:br/>
-      </w:r>
-      <w:r>
-        <w:br/>
-      </w:r>
-      <w:r>
-        <w:rPr>
-          <w:rStyle w:val="ExtensionTok"/>
-        </w:rPr>
-        <w:t xml:space="preserve">$</w:t>
-      </w:r>
-      <w:r>
-        <w:rPr>
-          <w:rStyle w:val="NormalTok"/>
-        </w:rPr>
-        <w:t xml:space="preserve"> ls </w:t>
-      </w:r>
-      <w:r>
-        <w:rPr>
-          <w:rStyle w:val="KeywordTok"/>
-        </w:rPr>
-        <w:t xml:space="preserve">|</w:t>
-      </w:r>
-      <w:r>
-        <w:rPr>
-          <w:rStyle w:val="NormalTok"/>
-        </w:rPr>
-        <w:t xml:space="preserve"> </w:t>
-      </w:r>
-      <w:r>
-        <w:rPr>
-          <w:rStyle w:val="FunctionTok"/>
-        </w:rPr>
-        <w:t xml:space="preserve">grep</w:t>
-      </w:r>
-      <w:r>
-        <w:rPr>
-          <w:rStyle w:val="NormalTok"/>
-        </w:rPr>
-        <w:t xml:space="preserve"> c</w:t>
-      </w:r>
-      <w:r>
-        <w:br/>
-      </w:r>
-      <w:r>
-        <w:rPr>
-          <w:rStyle w:val="FunctionTok"/>
-        </w:rPr>
-        <w:t xml:space="preserve">cat</w:t>
-      </w:r>
-      <w:r>
-        <w:rPr>
-          <w:rStyle w:val="NormalTok"/>
-        </w:rPr>
-        <w:t xml:space="preserve">            2 3 32800</w:t>
-      </w:r>
-      <w:r>
-        <w:br/>
-      </w:r>
-      <w:r>
-        <w:rPr>
-          <w:rStyle w:val="FunctionTok"/>
-        </w:rPr>
-        <w:t xml:space="preserve">wc</w:t>
-      </w:r>
-      <w:r>
-        <w:rPr>
-          <w:rStyle w:val="NormalTok"/>
-        </w:rPr>
-        <w:t xml:space="preserve">             2 17 33496</w:t>
-      </w:r>
-      <w:r>
-        <w:br/>
-      </w:r>
-      <w:r>
-        <w:rPr>
-          <w:rStyle w:val="FunctionTok"/>
-        </w:rPr>
-        <w:t xml:space="preserve">sync</w:t>
-      </w:r>
-      <w:r>
-        <w:rPr>
-          <w:rStyle w:val="NormalTok"/>
-        </w:rPr>
-        <w:t xml:space="preserve">           2 22 31104</w:t>
-      </w:r>
-      <w:r>
-        <w:br/>
-      </w:r>
-      <w:r>
-        <w:rPr>
-          <w:rStyle w:val="ExtensionTok"/>
-        </w:rPr>
-        <w:t xml:space="preserve">console</w:t>
-      </w:r>
-      <w:r>
-        <w:rPr>
-          <w:rStyle w:val="NormalTok"/>
-        </w:rPr>
-        <w:t xml:space="preserve">        3 23 0</w:t>
-      </w:r>
-      <w:r>
-        <w:br/>
-      </w:r>
-      <w:r>
-        <w:br/>
-      </w:r>
-      <w:r>
-        <w:rPr>
-          <w:rStyle w:val="ExtensionTok"/>
-        </w:rPr>
-        <w:t xml:space="preserve">$</w:t>
-      </w:r>
-      <w:r>
-        <w:rPr>
-          <w:rStyle w:val="NormalTok"/>
-        </w:rPr>
-        <w:t xml:space="preserve"> wc README</w:t>
-      </w:r>
-      <w:r>
-        <w:br/>
-      </w:r>
-      <w:r>
-        <w:rPr>
-          <w:rStyle w:val="ExtensionTok"/>
-        </w:rPr>
-        <w:t xml:space="preserve">47</w:t>
-      </w:r>
-      <w:r>
-        <w:rPr>
-          <w:rStyle w:val="NormalTok"/>
-        </w:rPr>
-        <w:t xml:space="preserve"> 314 2441 README</w:t>
-      </w:r>
-    </w:p>
-    <w:bookmarkEnd w:id="14"/>
-    <w:bookmarkStart w:id="15" w:name="_363762c5bbaf1a75279208339e19ee7be728358"/>
-    <w:p>
-      <w:pPr>
-        <w:pStyle w:val="Heading3"/>
-      </w:pPr>
-      <w:r>
-        <w:t xml:space="preserve">Observe (Part 2 Answers)</w:t>
-      </w:r>
+      <w:bookmarkStart w:id="12" w:name="_79bae9dfd081c048554c3e4a17a1014fa2a52be"/>
+      <w:r>
+        <w:t xml:space="preserve">Purpose of the Work</w:t>
+      </w:r>
+      <w:bookmarkEnd w:id="12"/>
     </w:p>
     <w:p>
       <w:pPr>
@@ -1195,210 +358,7 @@
         </w:numPr>
       </w:pPr>
       <w:r>
-        <w:rPr>
-          <w:b/>
-          <w:bCs/>
-        </w:rPr>
-        <w:t xml:space="preserve">List three programs xv6 ships with:</w:t>
-      </w:r>
-    </w:p>
-    <w:p>
-      <w:pPr>
-        <w:pStyle w:val="Compact"/>
-        <w:numPr>
-          <w:ilvl w:val="1"/>
-          <w:numId w:val="1003"/>
-        </w:numPr>
-      </w:pPr>
-      <w:r>
-        <w:rPr>
-          <w:rStyle w:val="VerbatimChar"/>
-        </w:rPr>
-        <w:t xml:space="preserve">ls</w:t>
-      </w:r>
-      <w:r>
-        <w:t xml:space="preserve">: Lists directory entries with file type, inode number, and size.</w:t>
-      </w:r>
-    </w:p>
-    <w:p>
-      <w:pPr>
-        <w:pStyle w:val="Compact"/>
-        <w:numPr>
-          <w:ilvl w:val="1"/>
-          <w:numId w:val="1003"/>
-        </w:numPr>
-      </w:pPr>
-      <w:r>
-        <w:rPr>
-          <w:rStyle w:val="VerbatimChar"/>
-        </w:rPr>
-        <w:t xml:space="preserve">cat</w:t>
-      </w:r>
-      <w:r>
-        <w:t xml:space="preserve">: Concatenates and displays file contents on standard output.</w:t>
-      </w:r>
-    </w:p>
-    <w:p>
-      <w:pPr>
-        <w:pStyle w:val="Compact"/>
-        <w:numPr>
-          <w:ilvl w:val="1"/>
-          <w:numId w:val="1003"/>
-        </w:numPr>
-      </w:pPr>
-      <w:r>
-        <w:rPr>
-          <w:rStyle w:val="VerbatimChar"/>
-        </w:rPr>
-        <w:t xml:space="preserve">echo</w:t>
-      </w:r>
-      <w:r>
-        <w:t xml:space="preserve">: Prints its command-line arguments to standard output.</w:t>
-      </w:r>
-      <w:r>
-        <w:t xml:space="preserve"> </w:t>
-      </w:r>
-      <w:r>
-        <w:rPr>
-          <w:i/>
-          <w:iCs/>
-        </w:rPr>
-        <w:t xml:space="preserve">(Other utilities include</w:t>
-      </w:r>
-      <w:r>
-        <w:rPr>
-          <w:i/>
-          <w:iCs/>
-        </w:rPr>
-        <w:t xml:space="preserve"> </w:t>
-      </w:r>
-      <w:r>
-        <w:rPr>
-          <w:rStyle w:val="VerbatimChar"/>
-          <w:i/>
-          <w:iCs/>
-        </w:rPr>
-        <w:t xml:space="preserve">sh</w:t>
-      </w:r>
-      <w:r>
-        <w:rPr>
-          <w:i/>
-          <w:iCs/>
-        </w:rPr>
-        <w:t xml:space="preserve">,</w:t>
-      </w:r>
-      <w:r>
-        <w:rPr>
-          <w:i/>
-          <w:iCs/>
-        </w:rPr>
-        <w:t xml:space="preserve"> </w:t>
-      </w:r>
-      <w:r>
-        <w:rPr>
-          <w:rStyle w:val="VerbatimChar"/>
-          <w:i/>
-          <w:iCs/>
-        </w:rPr>
-        <w:t xml:space="preserve">grep</w:t>
-      </w:r>
-      <w:r>
-        <w:rPr>
-          <w:i/>
-          <w:iCs/>
-        </w:rPr>
-        <w:t xml:space="preserve">,</w:t>
-      </w:r>
-      <w:r>
-        <w:rPr>
-          <w:i/>
-          <w:iCs/>
-        </w:rPr>
-        <w:t xml:space="preserve"> </w:t>
-      </w:r>
-      <w:r>
-        <w:rPr>
-          <w:rStyle w:val="VerbatimChar"/>
-          <w:i/>
-          <w:iCs/>
-        </w:rPr>
-        <w:t xml:space="preserve">wc</w:t>
-      </w:r>
-      <w:r>
-        <w:rPr>
-          <w:i/>
-          <w:iCs/>
-        </w:rPr>
-        <w:t xml:space="preserve">,</w:t>
-      </w:r>
-      <w:r>
-        <w:rPr>
-          <w:i/>
-          <w:iCs/>
-        </w:rPr>
-        <w:t xml:space="preserve"> </w:t>
-      </w:r>
-      <w:r>
-        <w:rPr>
-          <w:rStyle w:val="VerbatimChar"/>
-          <w:i/>
-          <w:iCs/>
-        </w:rPr>
-        <w:t xml:space="preserve">rm</w:t>
-      </w:r>
-      <w:r>
-        <w:rPr>
-          <w:i/>
-          <w:iCs/>
-        </w:rPr>
-        <w:t xml:space="preserve">,</w:t>
-      </w:r>
-      <w:r>
-        <w:rPr>
-          <w:i/>
-          <w:iCs/>
-        </w:rPr>
-        <w:t xml:space="preserve"> </w:t>
-      </w:r>
-      <w:r>
-        <w:rPr>
-          <w:rStyle w:val="VerbatimChar"/>
-          <w:i/>
-          <w:iCs/>
-        </w:rPr>
-        <w:t xml:space="preserve">mkdir</w:t>
-      </w:r>
-      <w:r>
-        <w:rPr>
-          <w:i/>
-          <w:iCs/>
-        </w:rPr>
-        <w:t xml:space="preserve">, and</w:t>
-      </w:r>
-      <w:r>
-        <w:rPr>
-          <w:i/>
-          <w:iCs/>
-        </w:rPr>
-        <w:t xml:space="preserve"> </w:t>
-      </w:r>
-      <w:r>
-        <w:rPr>
-          <w:rStyle w:val="VerbatimChar"/>
-          <w:i/>
-          <w:iCs/>
-        </w:rPr>
-        <w:t xml:space="preserve">kill</w:t>
-      </w:r>
-      <w:r>
-        <w:rPr>
-          <w:i/>
-          <w:iCs/>
-        </w:rPr>
-        <w:t xml:space="preserve">)</w:t>
-      </w:r>
-      <w:r>
-        <w:t xml:space="preserve">.</w:t>
+        <w:t xml:space="preserve">Set up the RISC-V cross-compilation toolchain and QEMU system emulator to build and boot the xv6 educational operating system.</w:t>
       </w:r>
     </w:p>
     <w:p>
@@ -1410,26 +370,1158 @@
         </w:numPr>
       </w:pPr>
       <w:r>
+        <w:t xml:space="preserve">Experience the xv6 shell user interface and verify standard Unix utilities (</w:t>
+      </w:r>
+      <w:r>
+        <w:rPr>
+          <w:rStyle w:val="VerbatimChar"/>
+        </w:rPr>
+        <w:t xml:space="preserve">cat</w:t>
+      </w:r>
+      <w:r>
+        <w:t xml:space="preserve">,</w:t>
+      </w:r>
+      <w:r>
+        <w:t xml:space="preserve"> </w:t>
+      </w:r>
+      <w:r>
+        <w:rPr>
+          <w:rStyle w:val="VerbatimChar"/>
+        </w:rPr>
+        <w:t xml:space="preserve">ls</w:t>
+      </w:r>
+      <w:r>
+        <w:t xml:space="preserve">,</w:t>
+      </w:r>
+      <w:r>
+        <w:t xml:space="preserve"> </w:t>
+      </w:r>
+      <w:r>
+        <w:rPr>
+          <w:rStyle w:val="VerbatimChar"/>
+        </w:rPr>
+        <w:t xml:space="preserve">echo</w:t>
+      </w:r>
+      <w:r>
+        <w:t xml:space="preserve">,</w:t>
+      </w:r>
+      <w:r>
+        <w:t xml:space="preserve"> </w:t>
+      </w:r>
+      <w:r>
+        <w:rPr>
+          <w:rStyle w:val="VerbatimChar"/>
+        </w:rPr>
+        <w:t xml:space="preserve">grep</w:t>
+      </w:r>
+      <w:r>
+        <w:t xml:space="preserve">,</w:t>
+      </w:r>
+      <w:r>
+        <w:t xml:space="preserve"> </w:t>
+      </w:r>
+      <w:r>
+        <w:rPr>
+          <w:rStyle w:val="VerbatimChar"/>
+        </w:rPr>
+        <w:t xml:space="preserve">wc</w:t>
+      </w:r>
+      <w:r>
+        <w:t xml:space="preserve">, and pipes).</w:t>
+      </w:r>
+    </w:p>
+    <w:p>
+      <w:pPr>
+        <w:pStyle w:val="Compact"/>
+        <w:numPr>
+          <w:ilvl w:val="0"/>
+          <w:numId w:val="1002"/>
+        </w:numPr>
+      </w:pPr>
+      <w:r>
+        <w:t xml:space="preserve">Study the architectural separation between privileged kernel space (RISC-V Supervisor mode) and unprivileged user space (User mode).</w:t>
+      </w:r>
+    </w:p>
+    <w:p>
+      <w:pPr>
+        <w:pStyle w:val="Compact"/>
+        <w:numPr>
+          <w:ilvl w:val="0"/>
+          <w:numId w:val="1002"/>
+        </w:numPr>
+      </w:pPr>
+      <w:r>
+        <w:t xml:space="preserve">Trace the system call execution path from user C function calls through assembly trap stubs (</w:t>
+      </w:r>
+      <w:r>
+        <w:rPr>
+          <w:rStyle w:val="VerbatimChar"/>
+        </w:rPr>
+        <w:t xml:space="preserve">ecall</w:t>
+      </w:r>
+      <w:r>
+        <w:t xml:space="preserve">) to kernel dispatchers (</w:t>
+      </w:r>
+      <w:r>
+        <w:rPr>
+          <w:rStyle w:val="VerbatimChar"/>
+        </w:rPr>
+        <w:t xml:space="preserve">kernel/syscall.c</w:t>
+      </w:r>
+      <w:r>
+        <w:t xml:space="preserve">,</w:t>
+      </w:r>
+      <w:r>
+        <w:t xml:space="preserve"> </w:t>
+      </w:r>
+      <w:r>
+        <w:rPr>
+          <w:rStyle w:val="VerbatimChar"/>
+        </w:rPr>
+        <w:t xml:space="preserve">kernel/sysfile.c</w:t>
+      </w:r>
+      <w:r>
+        <w:t xml:space="preserve">).</w:t>
+      </w:r>
+    </w:p>
+    <w:p>
+      <w:pPr>
+        <w:pStyle w:val="Compact"/>
+        <w:numPr>
+          <w:ilvl w:val="0"/>
+          <w:numId w:val="1002"/>
+        </w:numPr>
+      </w:pPr>
+      <w:r>
+        <w:t xml:space="preserve">Author, integrate, and verify a new user-space utility (</w:t>
+      </w:r>
+      <w:r>
+        <w:rPr>
+          <w:rStyle w:val="VerbatimChar"/>
+        </w:rPr>
+        <w:t xml:space="preserve">user/sleep.c</w:t>
+      </w:r>
+      <w:r>
+        <w:t xml:space="preserve">) within the xv6 build system using the</w:t>
+      </w:r>
+      <w:r>
+        <w:t xml:space="preserve"> </w:t>
+      </w:r>
+      <w:r>
+        <w:rPr>
+          <w:rStyle w:val="VerbatimChar"/>
+        </w:rPr>
+        <w:t xml:space="preserve">pause()</w:t>
+      </w:r>
+      <w:r>
+        <w:t xml:space="preserve"> </w:t>
+      </w:r>
+      <w:r>
+        <w:t xml:space="preserve">system call.</w:t>
+      </w:r>
+    </w:p>
+    <w:p>
+      <w:r>
+        <w:pict>
+          <v:rect style="width:0;height:1.5pt" o:hralign="center" o:hrstd="t" o:hr="t"/>
+        </w:pict>
+      </w:r>
+    </w:p>
+    <w:p>
+      <w:pPr>
+        <w:pStyle w:val="Heading2"/>
+      </w:pPr>
+      <w:bookmarkStart w:id="13" w:name="_6d272b69cc374da6539b6ce1d36f9703dfd49f3"/>
+      <w:r>
+        <w:t xml:space="preserve">Part 1. Build It and Boot It</w:t>
+      </w:r>
+      <w:bookmarkEnd w:id="13"/>
+    </w:p>
+    <w:p>
+      <w:pPr>
+        <w:pStyle w:val="Heading3"/>
+      </w:pPr>
+      <w:bookmarkStart w:id="14" w:name="_c3067736b3415a7ad5e31df7e09d73c6406016b"/>
+      <w:r>
+        <w:t xml:space="preserve">1. Compiling and Launching xv6</w:t>
+      </w:r>
+      <w:bookmarkEnd w:id="14"/>
+    </w:p>
+    <w:p>
+      <w:pPr>
+        <w:pStyle w:val="FirstParagraph"/>
+      </w:pPr>
+      <w:r>
+        <w:t xml:space="preserve">To compile the kernel, bootstrap loader, and user-space utilities, and then launch them under QEMU:</w:t>
+      </w:r>
+    </w:p>
+    <w:p>
+      <w:pPr>
+        <w:pStyle w:val="SourceCode"/>
+      </w:pPr>
+      <w:r>
+        <w:rPr>
+          <w:rStyle w:val="ExtensionTok"/>
+        </w:rPr>
+        <w:t xml:space="preserve">❯</w:t>
+      </w:r>
+      <w:r>
+        <w:rPr>
+          <w:rStyle w:val="NormalTok"/>
+        </w:rPr>
+        <w:t xml:space="preserve"> make qemu</w:t>
+      </w:r>
+      <w:r>
+        <w:br/>
+      </w:r>
+      <w:r>
+        <w:rPr>
+          <w:rStyle w:val="ExtensionTok"/>
+        </w:rPr>
+        <w:t xml:space="preserve">qemu-system-riscv64</w:t>
+      </w:r>
+      <w:r>
+        <w:rPr>
+          <w:rStyle w:val="NormalTok"/>
+        </w:rPr>
+        <w:t xml:space="preserve"> </w:t>
+      </w:r>
+      <w:r>
+        <w:rPr>
+          <w:rStyle w:val="AttributeTok"/>
+        </w:rPr>
+        <w:t xml:space="preserve">-machine</w:t>
+      </w:r>
+      <w:r>
+        <w:rPr>
+          <w:rStyle w:val="NormalTok"/>
+        </w:rPr>
+        <w:t xml:space="preserve"> virt </w:t>
+      </w:r>
+      <w:r>
+        <w:rPr>
+          <w:rStyle w:val="AttributeTok"/>
+        </w:rPr>
+        <w:t xml:space="preserve">-bios</w:t>
+      </w:r>
+      <w:r>
+        <w:rPr>
+          <w:rStyle w:val="NormalTok"/>
+        </w:rPr>
+        <w:t xml:space="preserve"> none </w:t>
+      </w:r>
+      <w:r>
+        <w:rPr>
+          <w:rStyle w:val="AttributeTok"/>
+        </w:rPr>
+        <w:t xml:space="preserve">-kernel</w:t>
+      </w:r>
+      <w:r>
+        <w:rPr>
+          <w:rStyle w:val="NormalTok"/>
+        </w:rPr>
+        <w:t xml:space="preserve"> kernel/kernel </w:t>
+      </w:r>
+      <w:r>
+        <w:rPr>
+          <w:rStyle w:val="AttributeTok"/>
+        </w:rPr>
+        <w:t xml:space="preserve">-m</w:t>
+      </w:r>
+      <w:r>
+        <w:rPr>
+          <w:rStyle w:val="NormalTok"/>
+        </w:rPr>
+        <w:t xml:space="preserve"> 128M </w:t>
+      </w:r>
+      <w:r>
+        <w:rPr>
+          <w:rStyle w:val="AttributeTok"/>
+        </w:rPr>
+        <w:t xml:space="preserve">-smp</w:t>
+      </w:r>
+      <w:r>
+        <w:rPr>
+          <w:rStyle w:val="NormalTok"/>
+        </w:rPr>
+        <w:t xml:space="preserve"> 3 </w:t>
+      </w:r>
+      <w:r>
+        <w:rPr>
+          <w:rStyle w:val="AttributeTok"/>
+        </w:rPr>
+        <w:t xml:space="preserve">-nographic</w:t>
+      </w:r>
+      <w:r>
+        <w:rPr>
+          <w:rStyle w:val="NormalTok"/>
+        </w:rPr>
+        <w:t xml:space="preserve"> </w:t>
+      </w:r>
+      <w:r>
+        <w:rPr>
+          <w:rStyle w:val="AttributeTok"/>
+        </w:rPr>
+        <w:t xml:space="preserve">-drive</w:t>
+      </w:r>
+      <w:r>
+        <w:rPr>
+          <w:rStyle w:val="NormalTok"/>
+        </w:rPr>
+        <w:t xml:space="preserve"> file=fs.img,if=none,format=raw,id=x0 </w:t>
+      </w:r>
+      <w:r>
+        <w:rPr>
+          <w:rStyle w:val="AttributeTok"/>
+        </w:rPr>
+        <w:t xml:space="preserve">-device</w:t>
+      </w:r>
+      <w:r>
+        <w:rPr>
+          <w:rStyle w:val="NormalTok"/>
+        </w:rPr>
+        <w:t xml:space="preserve"> virtio-blk-device,drive=x0,bus=virtio-mmio-bus.0</w:t>
+      </w:r>
+      <w:r>
+        <w:br/>
+      </w:r>
+      <w:r>
+        <w:br/>
+      </w:r>
+      <w:r>
+        <w:rPr>
+          <w:rStyle w:val="ExtensionTok"/>
+        </w:rPr>
+        <w:t xml:space="preserve">xv6</w:t>
+      </w:r>
+      <w:r>
+        <w:rPr>
+          <w:rStyle w:val="NormalTok"/>
+        </w:rPr>
+        <w:t xml:space="preserve"> kernel is booting</w:t>
+      </w:r>
+      <w:r>
+        <w:br/>
+      </w:r>
+      <w:r>
+        <w:br/>
+      </w:r>
+      <w:r>
+        <w:rPr>
+          <w:rStyle w:val="ExtensionTok"/>
+        </w:rPr>
+        <w:t xml:space="preserve">hart</w:t>
+      </w:r>
+      <w:r>
+        <w:rPr>
+          <w:rStyle w:val="NormalTok"/>
+        </w:rPr>
+        <w:t xml:space="preserve"> 2 starting</w:t>
+      </w:r>
+      <w:r>
+        <w:br/>
+      </w:r>
+      <w:r>
+        <w:rPr>
+          <w:rStyle w:val="ExtensionTok"/>
+        </w:rPr>
+        <w:t xml:space="preserve">hart</w:t>
+      </w:r>
+      <w:r>
+        <w:rPr>
+          <w:rStyle w:val="NormalTok"/>
+        </w:rPr>
+        <w:t xml:space="preserve"> 1 starting</w:t>
+      </w:r>
+      <w:r>
+        <w:br/>
+      </w:r>
+      <w:r>
+        <w:rPr>
+          <w:rStyle w:val="ExtensionTok"/>
+        </w:rPr>
+        <w:t xml:space="preserve">init:</w:t>
+      </w:r>
+      <w:r>
+        <w:rPr>
+          <w:rStyle w:val="NormalTok"/>
+        </w:rPr>
+        <w:t xml:space="preserve"> starting sh</w:t>
+      </w:r>
+      <w:r>
+        <w:br/>
+      </w:r>
+      <w:r>
+        <w:rPr>
+          <w:rStyle w:val="ExtensionTok"/>
+        </w:rPr>
+        <w:t xml:space="preserve">$</w:t>
+      </w:r>
+      <w:r>
+        <w:rPr>
+          <w:rStyle w:val="NormalTok"/>
+        </w:rPr>
+        <w:t xml:space="preserve"> </w:t>
+      </w:r>
+    </w:p>
+    <w:p>
+      <w:pPr>
+        <w:pStyle w:val="Heading3"/>
+      </w:pPr>
+      <w:bookmarkStart w:id="15" w:name="_0ef0bc1860ff7be9ef71eade4df7db8739ddac3"/>
+      <w:r>
+        <w:t xml:space="preserve">2. Exiting QEMU</w:t>
+      </w:r>
+      <w:bookmarkEnd w:id="15"/>
+    </w:p>
+    <w:p>
+      <w:pPr>
+        <w:pStyle w:val="FirstParagraph"/>
+      </w:pPr>
+      <w:r>
+        <w:t xml:space="preserve">xv6 executes inside the QEMU hardware emulator. To quit and return to the host terminal:</w:t>
+      </w:r>
+      <w:r>
+        <w:t xml:space="preserve"> </w:t>
+      </w:r>
+      <w:r>
+        <w:t xml:space="preserve">- Press</w:t>
+      </w:r>
+      <w:r>
+        <w:t xml:space="preserve"> </w:t>
+      </w:r>
+      <w:r>
+        <w:rPr>
+          <w:rStyle w:val="VerbatimChar"/>
+        </w:rPr>
+        <w:t xml:space="preserve">Ctrl-A</w:t>
+      </w:r>
+      <w:r>
+        <w:t xml:space="preserve">, release, then press</w:t>
+      </w:r>
+      <w:r>
+        <w:t xml:space="preserve"> </w:t>
+      </w:r>
+      <w:r>
+        <w:rPr>
+          <w:rStyle w:val="VerbatimChar"/>
+        </w:rPr>
+        <w:t xml:space="preserve">X</w:t>
+      </w:r>
+      <w:r>
+        <w:t xml:space="preserve">.</w:t>
+      </w:r>
+    </w:p>
+    <w:p>
+      <w:r>
+        <w:pict>
+          <v:rect style="width:0;height:1.5pt" o:hralign="center" o:hrstd="t" o:hr="t"/>
+        </w:pict>
+      </w:r>
+    </w:p>
+    <w:p>
+      <w:pPr>
+        <w:pStyle w:val="Heading2"/>
+      </w:pPr>
+      <w:bookmarkStart w:id="16" w:name="_efc1f70556d64650caadec06f9b3ad72587a3cc"/>
+      <w:r>
+        <w:t xml:space="preserve">Part 2. Use xv6 as the Unix It Is</w:t>
+      </w:r>
+      <w:bookmarkEnd w:id="16"/>
+    </w:p>
+    <w:p>
+      <w:pPr>
+        <w:pStyle w:val="Heading3"/>
+      </w:pPr>
+      <w:bookmarkStart w:id="17" w:name="_ac6671fb0000910ab4427d75e73a1c35d8d6834"/>
+      <w:r>
+        <w:t xml:space="preserve">Commands Tested Inside xv6</w:t>
+      </w:r>
+      <w:bookmarkEnd w:id="17"/>
+    </w:p>
+    <w:p>
+      <w:pPr>
+        <w:pStyle w:val="SourceCode"/>
+      </w:pPr>
+      <w:r>
+        <w:rPr>
+          <w:rStyle w:val="ExtensionTok"/>
+        </w:rPr>
+        <w:t xml:space="preserve">$</w:t>
+      </w:r>
+      <w:r>
+        <w:rPr>
+          <w:rStyle w:val="NormalTok"/>
+        </w:rPr>
+        <w:t xml:space="preserve"> ls</w:t>
+      </w:r>
+      <w:r>
+        <w:br/>
+      </w:r>
+      <w:r>
+        <w:rPr>
+          <w:rStyle w:val="BuiltInTok"/>
+        </w:rPr>
+        <w:t xml:space="preserve">.</w:t>
+      </w:r>
+      <w:r>
+        <w:rPr>
+          <w:rStyle w:val="NormalTok"/>
+        </w:rPr>
+        <w:t xml:space="preserve">              1 1 1024</w:t>
+      </w:r>
+      <w:r>
+        <w:br/>
+      </w:r>
+      <w:r>
+        <w:rPr>
+          <w:rStyle w:val="ExtensionTok"/>
+        </w:rPr>
+        <w:t xml:space="preserve">..</w:t>
+      </w:r>
+      <w:r>
+        <w:rPr>
+          <w:rStyle w:val="NormalTok"/>
+        </w:rPr>
+        <w:t xml:space="preserve">             1 1 1024</w:t>
+      </w:r>
+      <w:r>
+        <w:br/>
+      </w:r>
+      <w:r>
+        <w:rPr>
+          <w:rStyle w:val="ExtensionTok"/>
+        </w:rPr>
+        <w:t xml:space="preserve">README</w:t>
+      </w:r>
+      <w:r>
+        <w:rPr>
+          <w:rStyle w:val="NormalTok"/>
+        </w:rPr>
+        <w:t xml:space="preserve">         2 2 2441</w:t>
+      </w:r>
+      <w:r>
+        <w:br/>
+      </w:r>
+      <w:r>
+        <w:rPr>
+          <w:rStyle w:val="FunctionTok"/>
+        </w:rPr>
+        <w:t xml:space="preserve">cat</w:t>
+      </w:r>
+      <w:r>
+        <w:rPr>
+          <w:rStyle w:val="NormalTok"/>
+        </w:rPr>
+        <w:t xml:space="preserve">            2 3 32800</w:t>
+      </w:r>
+      <w:r>
+        <w:br/>
+      </w:r>
+      <w:r>
+        <w:rPr>
+          <w:rStyle w:val="BuiltInTok"/>
+        </w:rPr>
+        <w:t xml:space="preserve">echo</w:t>
+      </w:r>
+      <w:r>
+        <w:rPr>
+          <w:rStyle w:val="NormalTok"/>
+        </w:rPr>
+        <w:t xml:space="preserve">           2 4 31696</w:t>
+      </w:r>
+      <w:r>
+        <w:br/>
+      </w:r>
+      <w:r>
+        <w:rPr>
+          <w:rStyle w:val="ExtensionTok"/>
+        </w:rPr>
+        <w:t xml:space="preserve">forktest</w:t>
+      </w:r>
+      <w:r>
+        <w:rPr>
+          <w:rStyle w:val="NormalTok"/>
+        </w:rPr>
+        <w:t xml:space="preserve">       2 5 15856</w:t>
+      </w:r>
+      <w:r>
+        <w:br/>
+      </w:r>
+      <w:r>
+        <w:rPr>
+          <w:rStyle w:val="FunctionTok"/>
+        </w:rPr>
+        <w:t xml:space="preserve">grep</w:t>
+      </w:r>
+      <w:r>
+        <w:rPr>
+          <w:rStyle w:val="NormalTok"/>
+        </w:rPr>
+        <w:t xml:space="preserve">           2 6 36248</w:t>
+      </w:r>
+      <w:r>
+        <w:br/>
+      </w:r>
+      <w:r>
+        <w:rPr>
+          <w:rStyle w:val="ExtensionTok"/>
+        </w:rPr>
+        <w:t xml:space="preserve">init</w:t>
+      </w:r>
+      <w:r>
+        <w:rPr>
+          <w:rStyle w:val="NormalTok"/>
+        </w:rPr>
+        <w:t xml:space="preserve">           2 7 32176</w:t>
+      </w:r>
+      <w:r>
+        <w:br/>
+      </w:r>
+      <w:r>
+        <w:rPr>
+          <w:rStyle w:val="BuiltInTok"/>
+        </w:rPr>
+        <w:t xml:space="preserve">kill</w:t>
+      </w:r>
+      <w:r>
+        <w:rPr>
+          <w:rStyle w:val="NormalTok"/>
+        </w:rPr>
+        <w:t xml:space="preserve">           2 8 31568</w:t>
+      </w:r>
+      <w:r>
+        <w:br/>
+      </w:r>
+      <w:r>
+        <w:rPr>
+          <w:rStyle w:val="FunctionTok"/>
+        </w:rPr>
+        <w:t xml:space="preserve">ln</w:t>
+      </w:r>
+      <w:r>
+        <w:rPr>
+          <w:rStyle w:val="NormalTok"/>
+        </w:rPr>
+        <w:t xml:space="preserve">             2 9 31448</w:t>
+      </w:r>
+      <w:r>
+        <w:br/>
+      </w:r>
+      <w:r>
+        <w:rPr>
+          <w:rStyle w:val="FunctionTok"/>
+        </w:rPr>
+        <w:t xml:space="preserve">ls</w:t>
+      </w:r>
+      <w:r>
+        <w:rPr>
+          <w:rStyle w:val="NormalTok"/>
+        </w:rPr>
+        <w:t xml:space="preserve">             2 10 35056</w:t>
+      </w:r>
+      <w:r>
+        <w:br/>
+      </w:r>
+      <w:r>
+        <w:rPr>
+          <w:rStyle w:val="FunctionTok"/>
+        </w:rPr>
+        <w:t xml:space="preserve">mkdir</w:t>
+      </w:r>
+      <w:r>
+        <w:rPr>
+          <w:rStyle w:val="NormalTok"/>
+        </w:rPr>
+        <w:t xml:space="preserve">          2 11 31664</w:t>
+      </w:r>
+      <w:r>
+        <w:br/>
+      </w:r>
+      <w:r>
+        <w:rPr>
+          <w:rStyle w:val="FunctionTok"/>
+        </w:rPr>
+        <w:t xml:space="preserve">rm</w:t>
+      </w:r>
+      <w:r>
+        <w:rPr>
+          <w:rStyle w:val="NormalTok"/>
+        </w:rPr>
+        <w:t xml:space="preserve">             2 12 31648</w:t>
+      </w:r>
+      <w:r>
+        <w:br/>
+      </w:r>
+      <w:r>
+        <w:rPr>
+          <w:rStyle w:val="FunctionTok"/>
+        </w:rPr>
+        <w:t xml:space="preserve">sh</w:t>
+      </w:r>
+      <w:r>
+        <w:rPr>
+          <w:rStyle w:val="NormalTok"/>
+        </w:rPr>
+        <w:t xml:space="preserve">             2 13 54088</w:t>
+      </w:r>
+      <w:r>
+        <w:br/>
+      </w:r>
+      <w:r>
+        <w:rPr>
+          <w:rStyle w:val="ExtensionTok"/>
+        </w:rPr>
+        <w:t xml:space="preserve">stressfs</w:t>
+      </w:r>
+      <w:r>
+        <w:rPr>
+          <w:rStyle w:val="NormalTok"/>
+        </w:rPr>
+        <w:t xml:space="preserve">       2 14 32544</w:t>
+      </w:r>
+      <w:r>
+        <w:br/>
+      </w:r>
+      <w:r>
+        <w:rPr>
+          <w:rStyle w:val="ExtensionTok"/>
+        </w:rPr>
+        <w:t xml:space="preserve">usertests</w:t>
+      </w:r>
+      <w:r>
+        <w:rPr>
+          <w:rStyle w:val="NormalTok"/>
+        </w:rPr>
+        <w:t xml:space="preserve">      2 15 178872</w:t>
+      </w:r>
+      <w:r>
+        <w:br/>
+      </w:r>
+      <w:r>
+        <w:rPr>
+          <w:rStyle w:val="ExtensionTok"/>
+        </w:rPr>
+        <w:t xml:space="preserve">grind</w:t>
+      </w:r>
+      <w:r>
+        <w:rPr>
+          <w:rStyle w:val="NormalTok"/>
+        </w:rPr>
+        <w:t xml:space="preserve">          2 16 47688</w:t>
+      </w:r>
+      <w:r>
+        <w:br/>
+      </w:r>
+      <w:r>
+        <w:rPr>
+          <w:rStyle w:val="FunctionTok"/>
+        </w:rPr>
+        <w:t xml:space="preserve">wc</w:t>
+      </w:r>
+      <w:r>
+        <w:rPr>
+          <w:rStyle w:val="NormalTok"/>
+        </w:rPr>
+        <w:t xml:space="preserve">             2 17 33496</w:t>
+      </w:r>
+      <w:r>
+        <w:br/>
+      </w:r>
+      <w:r>
+        <w:rPr>
+          <w:rStyle w:val="ExtensionTok"/>
+        </w:rPr>
+        <w:t xml:space="preserve">zombie</w:t>
+      </w:r>
+      <w:r>
+        <w:rPr>
+          <w:rStyle w:val="NormalTok"/>
+        </w:rPr>
+        <w:t xml:space="preserve">         2 18 31032</w:t>
+      </w:r>
+      <w:r>
+        <w:br/>
+      </w:r>
+      <w:r>
+        <w:rPr>
+          <w:rStyle w:val="ExtensionTok"/>
+        </w:rPr>
+        <w:t xml:space="preserve">logstress</w:t>
+      </w:r>
+      <w:r>
+        <w:rPr>
+          <w:rStyle w:val="NormalTok"/>
+        </w:rPr>
+        <w:t xml:space="preserve">      2 19 33544</w:t>
+      </w:r>
+      <w:r>
+        <w:br/>
+      </w:r>
+      <w:r>
+        <w:rPr>
+          <w:rStyle w:val="ExtensionTok"/>
+        </w:rPr>
+        <w:t xml:space="preserve">forphan</w:t>
+      </w:r>
+      <w:r>
+        <w:rPr>
+          <w:rStyle w:val="NormalTok"/>
+        </w:rPr>
+        <w:t xml:space="preserve">        2 20 31736</w:t>
+      </w:r>
+      <w:r>
+        <w:br/>
+      </w:r>
+      <w:r>
+        <w:rPr>
+          <w:rStyle w:val="ExtensionTok"/>
+        </w:rPr>
+        <w:t xml:space="preserve">dorphan</w:t>
+      </w:r>
+      <w:r>
+        <w:rPr>
+          <w:rStyle w:val="NormalTok"/>
+        </w:rPr>
+        <w:t xml:space="preserve">        2 21 31600</w:t>
+      </w:r>
+      <w:r>
+        <w:br/>
+      </w:r>
+      <w:r>
+        <w:rPr>
+          <w:rStyle w:val="FunctionTok"/>
+        </w:rPr>
+        <w:t xml:space="preserve">sync</w:t>
+      </w:r>
+      <w:r>
+        <w:rPr>
+          <w:rStyle w:val="NormalTok"/>
+        </w:rPr>
+        <w:t xml:space="preserve">           2 22 31104</w:t>
+      </w:r>
+      <w:r>
+        <w:br/>
+      </w:r>
+      <w:r>
+        <w:rPr>
+          <w:rStyle w:val="ExtensionTok"/>
+        </w:rPr>
+        <w:t xml:space="preserve">console</w:t>
+      </w:r>
+      <w:r>
+        <w:rPr>
+          <w:rStyle w:val="NormalTok"/>
+        </w:rPr>
+        <w:t xml:space="preserve">        3 23 0</w:t>
+      </w:r>
+      <w:r>
+        <w:br/>
+      </w:r>
+      <w:r>
+        <w:br/>
+      </w:r>
+      <w:r>
+        <w:rPr>
+          <w:rStyle w:val="ExtensionTok"/>
+        </w:rPr>
+        <w:t xml:space="preserve">$</w:t>
+      </w:r>
+      <w:r>
+        <w:rPr>
+          <w:rStyle w:val="NormalTok"/>
+        </w:rPr>
+        <w:t xml:space="preserve"> cat README</w:t>
+      </w:r>
+      <w:r>
+        <w:br/>
+      </w:r>
+      <w:r>
+        <w:rPr>
+          <w:rStyle w:val="ExtensionTok"/>
+        </w:rPr>
+        <w:t xml:space="preserve">xv6</w:t>
+      </w:r>
+      <w:r>
+        <w:rPr>
+          <w:rStyle w:val="NormalTok"/>
+        </w:rPr>
+        <w:t xml:space="preserve"> is a re-implementation of Dennis Ritchie</w:t>
+      </w:r>
+      <w:r>
+        <w:rPr>
+          <w:rStyle w:val="StringTok"/>
+        </w:rPr>
+        <w:t xml:space="preserve">'s and Ken Thompson'</w:t>
+      </w:r>
+      <w:r>
+        <w:rPr>
+          <w:rStyle w:val="NormalTok"/>
+        </w:rPr>
+        <w:t xml:space="preserve">s Unix</w:t>
+      </w:r>
+      <w:r>
+        <w:br/>
+      </w:r>
+      <w:r>
+        <w:rPr>
+          <w:rStyle w:val="ExtensionTok"/>
+        </w:rPr>
+        <w:t xml:space="preserve">Version</w:t>
+      </w:r>
+      <w:r>
+        <w:rPr>
+          <w:rStyle w:val="NormalTok"/>
+        </w:rPr>
+        <w:t xml:space="preserve"> 6 </w:t>
+      </w:r>
+      <w:r>
+        <w:rPr>
+          <w:rStyle w:val="ErrorTok"/>
+        </w:rPr>
+        <w:t xml:space="preserve">(</w:t>
+      </w:r>
+      <w:r>
+        <w:rPr>
+          <w:rStyle w:val="ExtensionTok"/>
+        </w:rPr>
+        <w:t xml:space="preserve">v6</w:t>
+      </w:r>
+      <w:r>
+        <w:rPr>
+          <w:rStyle w:val="KeywordTok"/>
+        </w:rPr>
+        <w:t xml:space="preserve">)</w:t>
+      </w:r>
+      <w:r>
+        <w:rPr>
+          <w:rStyle w:val="BuiltInTok"/>
+        </w:rPr>
+        <w:t xml:space="preserve">.</w:t>
+      </w:r>
+      <w:r>
+        <w:rPr>
+          <w:rStyle w:val="NormalTok"/>
+        </w:rPr>
+        <w:t xml:space="preserve">  xv6 loosely follows the structure and style of v6,</w:t>
+      </w:r>
+      <w:r>
+        <w:br/>
+      </w:r>
+      <w:r>
+        <w:rPr>
+          <w:rStyle w:val="ExtensionTok"/>
+        </w:rPr>
+        <w:t xml:space="preserve">but</w:t>
+      </w:r>
+      <w:r>
+        <w:rPr>
+          <w:rStyle w:val="NormalTok"/>
+        </w:rPr>
+        <w:t xml:space="preserve"> is implemented for a modern RISC-V multiprocessor using ANSI C.</w:t>
+      </w:r>
+      <w:r>
+        <w:br/>
+      </w:r>
+      <w:r>
+        <w:rPr>
+          <w:rStyle w:val="ExtensionTok"/>
+        </w:rPr>
+        <w:t xml:space="preserve">...</w:t>
+      </w:r>
+      <w:r>
+        <w:br/>
+      </w:r>
+      <w:r>
+        <w:br/>
+      </w:r>
+      <w:r>
+        <w:rPr>
+          <w:rStyle w:val="ExtensionTok"/>
+        </w:rPr>
+        <w:t xml:space="preserve">$</w:t>
+      </w:r>
+      <w:r>
+        <w:rPr>
+          <w:rStyle w:val="NormalTok"/>
+        </w:rPr>
+        <w:t xml:space="preserve"> echo hello xv6</w:t>
+      </w:r>
+      <w:r>
+        <w:br/>
+      </w:r>
+      <w:r>
+        <w:rPr>
+          <w:rStyle w:val="ExtensionTok"/>
+        </w:rPr>
+        <w:t xml:space="preserve">hello</w:t>
+      </w:r>
+      <w:r>
+        <w:rPr>
+          <w:rStyle w:val="NormalTok"/>
+        </w:rPr>
+        <w:t xml:space="preserve"> xv6</w:t>
+      </w:r>
+      <w:r>
+        <w:br/>
+      </w:r>
+      <w:r>
+        <w:br/>
+      </w:r>
+      <w:r>
+        <w:rPr>
+          <w:rStyle w:val="ExtensionTok"/>
+        </w:rPr>
+        <w:t xml:space="preserve">$</w:t>
+      </w:r>
+      <w:r>
+        <w:rPr>
+          <w:rStyle w:val="NormalTok"/>
+        </w:rPr>
+        <w:t xml:space="preserve"> ls </w:t>
+      </w:r>
+      <w:r>
+        <w:rPr>
+          <w:rStyle w:val="KeywordTok"/>
+        </w:rPr>
+        <w:t xml:space="preserve">|</w:t>
+      </w:r>
+      <w:r>
+        <w:rPr>
+          <w:rStyle w:val="NormalTok"/>
+        </w:rPr>
+        <w:t xml:space="preserve"> </w:t>
+      </w:r>
+      <w:r>
+        <w:rPr>
+          <w:rStyle w:val="FunctionTok"/>
+        </w:rPr>
+        <w:t xml:space="preserve">grep</w:t>
+      </w:r>
+      <w:r>
+        <w:rPr>
+          <w:rStyle w:val="NormalTok"/>
+        </w:rPr>
+        <w:t xml:space="preserve"> c</w:t>
+      </w:r>
+      <w:r>
+        <w:br/>
+      </w:r>
+      <w:r>
+        <w:rPr>
+          <w:rStyle w:val="FunctionTok"/>
+        </w:rPr>
+        <w:t xml:space="preserve">cat</w:t>
+      </w:r>
+      <w:r>
+        <w:rPr>
+          <w:rStyle w:val="NormalTok"/>
+        </w:rPr>
+        <w:t xml:space="preserve">            2 3 32800</w:t>
+      </w:r>
+      <w:r>
+        <w:br/>
+      </w:r>
+      <w:r>
+        <w:rPr>
+          <w:rStyle w:val="FunctionTok"/>
+        </w:rPr>
+        <w:t xml:space="preserve">wc</w:t>
+      </w:r>
+      <w:r>
+        <w:rPr>
+          <w:rStyle w:val="NormalTok"/>
+        </w:rPr>
+        <w:t xml:space="preserve">             2 17 33496</w:t>
+      </w:r>
+      <w:r>
+        <w:br/>
+      </w:r>
+      <w:r>
+        <w:rPr>
+          <w:rStyle w:val="FunctionTok"/>
+        </w:rPr>
+        <w:t xml:space="preserve">sync</w:t>
+      </w:r>
+      <w:r>
+        <w:rPr>
+          <w:rStyle w:val="NormalTok"/>
+        </w:rPr>
+        <w:t xml:space="preserve">           2 22 31104</w:t>
+      </w:r>
+      <w:r>
+        <w:br/>
+      </w:r>
+      <w:r>
+        <w:rPr>
+          <w:rStyle w:val="ExtensionTok"/>
+        </w:rPr>
+        <w:t xml:space="preserve">console</w:t>
+      </w:r>
+      <w:r>
+        <w:rPr>
+          <w:rStyle w:val="NormalTok"/>
+        </w:rPr>
+        <w:t xml:space="preserve">        3 23 0</w:t>
+      </w:r>
+      <w:r>
+        <w:br/>
+      </w:r>
+      <w:r>
+        <w:br/>
+      </w:r>
+      <w:r>
+        <w:rPr>
+          <w:rStyle w:val="ExtensionTok"/>
+        </w:rPr>
+        <w:t xml:space="preserve">$</w:t>
+      </w:r>
+      <w:r>
+        <w:rPr>
+          <w:rStyle w:val="NormalTok"/>
+        </w:rPr>
+        <w:t xml:space="preserve"> wc README</w:t>
+      </w:r>
+      <w:r>
+        <w:br/>
+      </w:r>
+      <w:r>
+        <w:rPr>
+          <w:rStyle w:val="ExtensionTok"/>
+        </w:rPr>
+        <w:t xml:space="preserve">47</w:t>
+      </w:r>
+      <w:r>
+        <w:rPr>
+          <w:rStyle w:val="NormalTok"/>
+        </w:rPr>
+        <w:t xml:space="preserve"> 314 2441 README</w:t>
+      </w:r>
+    </w:p>
+    <w:p>
+      <w:pPr>
+        <w:pStyle w:val="Heading3"/>
+      </w:pPr>
+      <w:bookmarkStart w:id="18" w:name="_363762c5bbaf1a75279208339e19ee7be728358"/>
+      <w:r>
+        <w:t xml:space="preserve">Observe (Part 2 Answers)</w:t>
+      </w:r>
+      <w:bookmarkEnd w:id="18"/>
+    </w:p>
+    <w:p>
+      <w:pPr>
+        <w:pStyle w:val="Compact"/>
+        <w:numPr>
+          <w:ilvl w:val="0"/>
+          <w:numId w:val="1003"/>
+        </w:numPr>
+      </w:pPr>
+      <w:r>
         <w:rPr>
           <w:b/>
           <w:bCs/>
         </w:rPr>
-        <w:t xml:space="preserve">You just used a pipe (</w:t>
-      </w:r>
-      <w:r>
-        <w:rPr>
-          <w:rStyle w:val="VerbatimChar"/>
-          <w:b/>
-          <w:bCs/>
-        </w:rPr>
-        <w:t xml:space="preserve">|</w:t>
-      </w:r>
-      <w:r>
-        <w:rPr>
-          <w:b/>
-          <w:bCs/>
-        </w:rPr>
-        <w:t xml:space="preserve">) inside xv6. Which two OS features must exist for a pipe to work?</w:t>
+        <w:t xml:space="preserve">List three programs xv6 ships with:</w:t>
       </w:r>
     </w:p>
     <w:p>
@@ -1442,49 +1534,12 @@
       </w:pPr>
       <w:r>
         <w:rPr>
-          <w:b/>
-          <w:bCs/>
-        </w:rPr>
-        <w:t xml:space="preserve">Process Creation and Multiprocessing/Scheduling (</w:t>
-      </w:r>
-      <w:r>
-        <w:rPr>
-          <w:rStyle w:val="VerbatimChar"/>
-          <w:b/>
-          <w:bCs/>
-        </w:rPr>
-        <w:t xml:space="preserve">fork()</w:t>
-      </w:r>
-      <w:r>
-        <w:rPr>
-          <w:b/>
-          <w:bCs/>
-        </w:rPr>
-        <w:t xml:space="preserve">):</w:t>
-      </w:r>
-      <w:r>
-        <w:t xml:space="preserve"> </w:t>
-      </w:r>
-      <w:r>
-        <w:t xml:space="preserve">The operating system must be capable of creating, running, and context-switching two independent processes concurrently—a producer process (</w:t>
-      </w:r>
-      <w:r>
-        <w:rPr>
           <w:rStyle w:val="VerbatimChar"/>
         </w:rPr>
         <w:t xml:space="preserve">ls</w:t>
       </w:r>
       <w:r>
-        <w:t xml:space="preserve">) and a consumer process (</w:t>
-      </w:r>
-      <w:r>
-        <w:rPr>
-          <w:rStyle w:val="VerbatimChar"/>
-        </w:rPr>
-        <w:t xml:space="preserve">grep</w:t>
-      </w:r>
-      <w:r>
-        <w:t xml:space="preserve">).</w:t>
+        <w:t xml:space="preserve">: Lists directory entries with file type, inode number, and size.</w:t>
       </w:r>
     </w:p>
     <w:p>
@@ -1497,49 +1552,175 @@
       </w:pPr>
       <w:r>
         <w:rPr>
-          <w:b/>
-          <w:bCs/>
-        </w:rPr>
-        <w:t xml:space="preserve">Inter-Process Communication (IPC) via shared kernel buffers &amp; file descriptor abstraction (</w:t>
-      </w:r>
-      <w:r>
-        <w:rPr>
-          <w:rStyle w:val="VerbatimChar"/>
-          <w:b/>
-          <w:bCs/>
-        </w:rPr>
-        <w:t xml:space="preserve">pipe()</w:t>
-      </w:r>
-      <w:r>
-        <w:rPr>
-          <w:b/>
-          <w:bCs/>
-        </w:rPr>
-        <w:t xml:space="preserve">):</w:t>
-      </w:r>
-      <w:r>
-        <w:t xml:space="preserve"> </w:t>
-      </w:r>
-      <w:r>
-        <w:t xml:space="preserve">The operating system must allocate a synchronized in-memory ring buffer in kernel space that binds the standard output file descriptor (</w:t>
-      </w:r>
-      <w:r>
-        <w:rPr>
-          <w:rStyle w:val="VerbatimChar"/>
-        </w:rPr>
-        <w:t xml:space="preserve">fd 1</w:t>
-      </w:r>
-      <w:r>
-        <w:t xml:space="preserve">) of the writer process to the standard input file descriptor (</w:t>
-      </w:r>
-      <w:r>
-        <w:rPr>
-          <w:rStyle w:val="VerbatimChar"/>
-        </w:rPr>
-        <w:t xml:space="preserve">fd 0</w:t>
-      </w:r>
-      <w:r>
-        <w:t xml:space="preserve">) of the reader process, handling flow control and blocking reads/writes.</w:t>
+          <w:rStyle w:val="VerbatimChar"/>
+        </w:rPr>
+        <w:t xml:space="preserve">cat</w:t>
+      </w:r>
+      <w:r>
+        <w:t xml:space="preserve">: Concatenates and displays file contents on standard output.</w:t>
+      </w:r>
+    </w:p>
+    <w:p>
+      <w:pPr>
+        <w:pStyle w:val="Compact"/>
+        <w:numPr>
+          <w:ilvl w:val="1"/>
+          <w:numId w:val="1004"/>
+        </w:numPr>
+      </w:pPr>
+      <w:r>
+        <w:rPr>
+          <w:rStyle w:val="VerbatimChar"/>
+        </w:rPr>
+        <w:t xml:space="preserve">echo</w:t>
+      </w:r>
+      <w:r>
+        <w:t xml:space="preserve">: Prints its command-line arguments to standard output.</w:t>
+      </w:r>
+      <w:r>
+        <w:t xml:space="preserve"> </w:t>
+      </w:r>
+      <w:r>
+        <w:rPr>
+          <w:i/>
+          <w:iCs/>
+        </w:rPr>
+        <w:t xml:space="preserve">(Other utilities include</w:t>
+      </w:r>
+      <w:r>
+        <w:rPr>
+          <w:i/>
+          <w:iCs/>
+        </w:rPr>
+        <w:t xml:space="preserve"> </w:t>
+      </w:r>
+      <w:r>
+        <w:rPr>
+          <w:rStyle w:val="VerbatimChar"/>
+          <w:i/>
+          <w:iCs/>
+        </w:rPr>
+        <w:t xml:space="preserve">sh</w:t>
+      </w:r>
+      <w:r>
+        <w:rPr>
+          <w:i/>
+          <w:iCs/>
+        </w:rPr>
+        <w:t xml:space="preserve">,</w:t>
+      </w:r>
+      <w:r>
+        <w:rPr>
+          <w:i/>
+          <w:iCs/>
+        </w:rPr>
+        <w:t xml:space="preserve"> </w:t>
+      </w:r>
+      <w:r>
+        <w:rPr>
+          <w:rStyle w:val="VerbatimChar"/>
+          <w:i/>
+          <w:iCs/>
+        </w:rPr>
+        <w:t xml:space="preserve">grep</w:t>
+      </w:r>
+      <w:r>
+        <w:rPr>
+          <w:i/>
+          <w:iCs/>
+        </w:rPr>
+        <w:t xml:space="preserve">,</w:t>
+      </w:r>
+      <w:r>
+        <w:rPr>
+          <w:i/>
+          <w:iCs/>
+        </w:rPr>
+        <w:t xml:space="preserve"> </w:t>
+      </w:r>
+      <w:r>
+        <w:rPr>
+          <w:rStyle w:val="VerbatimChar"/>
+          <w:i/>
+          <w:iCs/>
+        </w:rPr>
+        <w:t xml:space="preserve">wc</w:t>
+      </w:r>
+      <w:r>
+        <w:rPr>
+          <w:i/>
+          <w:iCs/>
+        </w:rPr>
+        <w:t xml:space="preserve">,</w:t>
+      </w:r>
+      <w:r>
+        <w:rPr>
+          <w:i/>
+          <w:iCs/>
+        </w:rPr>
+        <w:t xml:space="preserve"> </w:t>
+      </w:r>
+      <w:r>
+        <w:rPr>
+          <w:rStyle w:val="VerbatimChar"/>
+          <w:i/>
+          <w:iCs/>
+        </w:rPr>
+        <w:t xml:space="preserve">rm</w:t>
+      </w:r>
+      <w:r>
+        <w:rPr>
+          <w:i/>
+          <w:iCs/>
+        </w:rPr>
+        <w:t xml:space="preserve">,</w:t>
+      </w:r>
+      <w:r>
+        <w:rPr>
+          <w:i/>
+          <w:iCs/>
+        </w:rPr>
+        <w:t xml:space="preserve"> </w:t>
+      </w:r>
+      <w:r>
+        <w:rPr>
+          <w:rStyle w:val="VerbatimChar"/>
+          <w:i/>
+          <w:iCs/>
+        </w:rPr>
+        <w:t xml:space="preserve">mkdir</w:t>
+      </w:r>
+      <w:r>
+        <w:rPr>
+          <w:i/>
+          <w:iCs/>
+        </w:rPr>
+        <w:t xml:space="preserve">, and</w:t>
+      </w:r>
+      <w:r>
+        <w:rPr>
+          <w:i/>
+          <w:iCs/>
+        </w:rPr>
+        <w:t xml:space="preserve"> </w:t>
+      </w:r>
+      <w:r>
+        <w:rPr>
+          <w:rStyle w:val="VerbatimChar"/>
+          <w:i/>
+          <w:iCs/>
+        </w:rPr>
+        <w:t xml:space="preserve">kill</w:t>
+      </w:r>
+      <w:r>
+        <w:rPr>
+          <w:i/>
+          <w:iCs/>
+        </w:rPr>
+        <w:t xml:space="preserve">)</w:t>
+      </w:r>
+      <w:r>
+        <w:t xml:space="preserve">.</w:t>
       </w:r>
     </w:p>
     <w:p>
@@ -1547,7 +1728,7 @@
         <w:pStyle w:val="Compact"/>
         <w:numPr>
           <w:ilvl w:val="0"/>
-          <w:numId w:val="1002"/>
+          <w:numId w:val="1003"/>
         </w:numPr>
       </w:pPr>
       <w:r>
@@ -1555,7 +1736,22 @@
           <w:b/>
           <w:bCs/>
         </w:rPr>
-        <w:t xml:space="preserve">In one sentence: how does the xv6 shell compare to the Linux shell from Lab 1?</w:t>
+        <w:t xml:space="preserve">You just used a pipe (</w:t>
+      </w:r>
+      <w:r>
+        <w:rPr>
+          <w:rStyle w:val="VerbatimChar"/>
+          <w:b/>
+          <w:bCs/>
+        </w:rPr>
+        <w:t xml:space="preserve">|</w:t>
+      </w:r>
+      <w:r>
+        <w:rPr>
+          <w:b/>
+          <w:bCs/>
+        </w:rPr>
+        <w:t xml:space="preserve">) inside xv6. Which two OS features must exist for a pipe to work?</w:t>
       </w:r>
     </w:p>
     <w:p>
@@ -1567,6 +1763,132 @@
         </w:numPr>
       </w:pPr>
       <w:r>
+        <w:rPr>
+          <w:b/>
+          <w:bCs/>
+        </w:rPr>
+        <w:t xml:space="preserve">Process Creation and Multiprocessing/Scheduling (</w:t>
+      </w:r>
+      <w:r>
+        <w:rPr>
+          <w:rStyle w:val="VerbatimChar"/>
+          <w:b/>
+          <w:bCs/>
+        </w:rPr>
+        <w:t xml:space="preserve">fork()</w:t>
+      </w:r>
+      <w:r>
+        <w:rPr>
+          <w:b/>
+          <w:bCs/>
+        </w:rPr>
+        <w:t xml:space="preserve">):</w:t>
+      </w:r>
+      <w:r>
+        <w:t xml:space="preserve"> </w:t>
+      </w:r>
+      <w:r>
+        <w:t xml:space="preserve">The operating system must be capable of creating, running, and context-switching two independent processes concurrently—a producer process (</w:t>
+      </w:r>
+      <w:r>
+        <w:rPr>
+          <w:rStyle w:val="VerbatimChar"/>
+        </w:rPr>
+        <w:t xml:space="preserve">ls</w:t>
+      </w:r>
+      <w:r>
+        <w:t xml:space="preserve">) and a consumer process (</w:t>
+      </w:r>
+      <w:r>
+        <w:rPr>
+          <w:rStyle w:val="VerbatimChar"/>
+        </w:rPr>
+        <w:t xml:space="preserve">grep</w:t>
+      </w:r>
+      <w:r>
+        <w:t xml:space="preserve">).</w:t>
+      </w:r>
+    </w:p>
+    <w:p>
+      <w:pPr>
+        <w:pStyle w:val="Compact"/>
+        <w:numPr>
+          <w:ilvl w:val="1"/>
+          <w:numId w:val="1005"/>
+        </w:numPr>
+      </w:pPr>
+      <w:r>
+        <w:rPr>
+          <w:b/>
+          <w:bCs/>
+        </w:rPr>
+        <w:t xml:space="preserve">Inter-Process Communication (IPC) via shared kernel buffers &amp; file descriptor abstraction (</w:t>
+      </w:r>
+      <w:r>
+        <w:rPr>
+          <w:rStyle w:val="VerbatimChar"/>
+          <w:b/>
+          <w:bCs/>
+        </w:rPr>
+        <w:t xml:space="preserve">pipe()</w:t>
+      </w:r>
+      <w:r>
+        <w:rPr>
+          <w:b/>
+          <w:bCs/>
+        </w:rPr>
+        <w:t xml:space="preserve">):</w:t>
+      </w:r>
+      <w:r>
+        <w:t xml:space="preserve"> </w:t>
+      </w:r>
+      <w:r>
+        <w:t xml:space="preserve">The operating system must allocate a synchronized in-memory ring buffer in kernel space that binds the standard output file descriptor (</w:t>
+      </w:r>
+      <w:r>
+        <w:rPr>
+          <w:rStyle w:val="VerbatimChar"/>
+        </w:rPr>
+        <w:t xml:space="preserve">fd 1</w:t>
+      </w:r>
+      <w:r>
+        <w:t xml:space="preserve">) of the writer process to the standard input file descriptor (</w:t>
+      </w:r>
+      <w:r>
+        <w:rPr>
+          <w:rStyle w:val="VerbatimChar"/>
+        </w:rPr>
+        <w:t xml:space="preserve">fd 0</w:t>
+      </w:r>
+      <w:r>
+        <w:t xml:space="preserve">) of the reader process, handling flow control and blocking reads/writes.</w:t>
+      </w:r>
+    </w:p>
+    <w:p>
+      <w:pPr>
+        <w:pStyle w:val="Compact"/>
+        <w:numPr>
+          <w:ilvl w:val="0"/>
+          <w:numId w:val="1003"/>
+        </w:numPr>
+      </w:pPr>
+      <w:r>
+        <w:rPr>
+          <w:b/>
+          <w:bCs/>
+        </w:rPr>
+        <w:t xml:space="preserve">In one sentence: how does the xv6 shell compare to the Linux shell from Lab 1?</w:t>
+      </w:r>
+    </w:p>
+    <w:p>
+      <w:pPr>
+        <w:pStyle w:val="Compact"/>
+        <w:numPr>
+          <w:ilvl w:val="1"/>
+          <w:numId w:val="1006"/>
+        </w:numPr>
+      </w:pPr>
+      <w:r>
         <w:t xml:space="preserve">While both shells interpret user commands and support fundamental Unix mechanisms like I/O redirection, pipes, and background execution (</w:t>
       </w:r>
       <w:r>
@@ -1586,25 +1908,25 @@
         </w:pict>
       </w:r>
     </w:p>
-    <w:bookmarkEnd w:id="15"/>
-    <w:bookmarkEnd w:id="16"/>
-    <w:bookmarkStart w:id="20" w:name="_a1b0a381fcbf6154173bc314a11e62bb1fea9b7"/>
     <w:p>
       <w:pPr>
         <w:pStyle w:val="Heading2"/>
       </w:pPr>
+      <w:bookmarkStart w:id="19" w:name="_a1b0a381fcbf6154173bc314a11e62bb1fea9b7"/>
       <w:r>
         <w:t xml:space="preserve">Part 3. Read the Source</w:t>
       </w:r>
-    </w:p>
-    <w:bookmarkStart w:id="17" w:name="_665b2b35468c1522009d75d43805b9d999afd05"/>
+      <w:bookmarkEnd w:id="19"/>
+    </w:p>
     <w:p>
       <w:pPr>
         <w:pStyle w:val="Heading3"/>
       </w:pPr>
+      <w:bookmarkStart w:id="20" w:name="_665b2b35468c1522009d75d43805b9d999afd05"/>
       <w:r>
         <w:t xml:space="preserve">1. Repository Structure: The Kernel/User Split</w:t>
       </w:r>
+      <w:bookmarkEnd w:id="20"/>
     </w:p>
     <w:p>
       <w:pPr>
@@ -1721,12 +2043,11 @@
         <w:t xml:space="preserve">, isolated from direct hardware access.</w:t>
       </w:r>
     </w:p>
-    <w:bookmarkEnd w:id="17"/>
-    <w:bookmarkStart w:id="18" w:name="_747a11bac754a8279a5323bc3a3fd8df44f3383"/>
     <w:p>
       <w:pPr>
         <w:pStyle w:val="Heading3"/>
       </w:pPr>
+      <w:bookmarkStart w:id="21" w:name="_747a11bac754a8279a5323bc3a3fd8df44f3383"/>
       <w:r>
         <w:t xml:space="preserve">2. Tracing System Calls in</w:t>
       </w:r>
@@ -1739,6 +2060,7 @@
         </w:rPr>
         <w:t xml:space="preserve">user/cat.c</w:t>
       </w:r>
+      <w:bookmarkEnd w:id="21"/>
     </w:p>
     <w:p>
       <w:pPr>
@@ -2526,22 +2848,22 @@
         <w:t xml:space="preserve">kernel handler.</w:t>
       </w:r>
     </w:p>
-    <w:bookmarkEnd w:id="18"/>
-    <w:bookmarkStart w:id="19" w:name="_7ac71985bd3d6798532efb20ab41f35025b04ed"/>
     <w:p>
       <w:pPr>
         <w:pStyle w:val="Heading3"/>
       </w:pPr>
+      <w:bookmarkStart w:id="22" w:name="_7ac71985bd3d6798532efb20ab41f35025b04ed"/>
       <w:r>
         <w:t xml:space="preserve">Observe (Part 3 Answers)</w:t>
       </w:r>
+      <w:bookmarkEnd w:id="22"/>
     </w:p>
     <w:p>
       <w:pPr>
         <w:pStyle w:val="Compact"/>
         <w:numPr>
           <w:ilvl w:val="0"/>
-          <w:numId w:val="1006"/>
+          <w:numId w:val="1007"/>
         </w:numPr>
       </w:pPr>
       <w:r>
@@ -2579,219 +2901,6 @@
           <w:bCs/>
         </w:rPr>
         <w:t xml:space="preserve">use, and what does each one ask the kernel to do?</w:t>
-      </w:r>
-    </w:p>
-    <w:p>
-      <w:pPr>
-        <w:pStyle w:val="Compact"/>
-        <w:numPr>
-          <w:ilvl w:val="1"/>
-          <w:numId w:val="1007"/>
-        </w:numPr>
-      </w:pPr>
-      <w:r>
-        <w:rPr>
-          <w:rStyle w:val="VerbatimChar"/>
-        </w:rPr>
-        <w:t xml:space="preserve">open(argv[i], O_RDONLY)</w:t>
-      </w:r>
-      <w:r>
-        <w:t xml:space="preserve">: Requests the kernel to open the specified file path in read-only mode, allocating an entry in the process’s file descriptor table and returning the integer file descriptor.</w:t>
-      </w:r>
-    </w:p>
-    <w:p>
-      <w:pPr>
-        <w:pStyle w:val="Compact"/>
-        <w:numPr>
-          <w:ilvl w:val="1"/>
-          <w:numId w:val="1007"/>
-        </w:numPr>
-      </w:pPr>
-      <w:r>
-        <w:rPr>
-          <w:rStyle w:val="VerbatimChar"/>
-        </w:rPr>
-        <w:t xml:space="preserve">read(fd, buf, sizeof(buf))</w:t>
-      </w:r>
-      <w:r>
-        <w:t xml:space="preserve">: Requests the kernel to read up to 512 bytes of data from the file or stream represented by</w:t>
-      </w:r>
-      <w:r>
-        <w:t xml:space="preserve"> </w:t>
-      </w:r>
-      <w:r>
-        <w:rPr>
-          <w:rStyle w:val="VerbatimChar"/>
-        </w:rPr>
-        <w:t xml:space="preserve">fd</w:t>
-      </w:r>
-      <w:r>
-        <w:t xml:space="preserve"> </w:t>
-      </w:r>
-      <w:r>
-        <w:t xml:space="preserve">into the user-space buffer</w:t>
-      </w:r>
-      <w:r>
-        <w:t xml:space="preserve"> </w:t>
-      </w:r>
-      <w:r>
-        <w:rPr>
-          <w:rStyle w:val="VerbatimChar"/>
-        </w:rPr>
-        <w:t xml:space="preserve">buf</w:t>
-      </w:r>
-      <w:r>
-        <w:t xml:space="preserve">.</w:t>
-      </w:r>
-    </w:p>
-    <w:p>
-      <w:pPr>
-        <w:pStyle w:val="Compact"/>
-        <w:numPr>
-          <w:ilvl w:val="1"/>
-          <w:numId w:val="1007"/>
-        </w:numPr>
-      </w:pPr>
-      <w:r>
-        <w:rPr>
-          <w:rStyle w:val="VerbatimChar"/>
-        </w:rPr>
-        <w:t xml:space="preserve">write(1, buf, n)</w:t>
-      </w:r>
-      <w:r>
-        <w:t xml:space="preserve">: Requests the kernel to transfer</w:t>
-      </w:r>
-      <w:r>
-        <w:t xml:space="preserve"> </w:t>
-      </w:r>
-      <w:r>
-        <w:rPr>
-          <w:rStyle w:val="VerbatimChar"/>
-        </w:rPr>
-        <w:t xml:space="preserve">n</w:t>
-      </w:r>
-      <w:r>
-        <w:t xml:space="preserve"> </w:t>
-      </w:r>
-      <w:r>
-        <w:t xml:space="preserve">bytes from the user buffer</w:t>
-      </w:r>
-      <w:r>
-        <w:t xml:space="preserve"> </w:t>
-      </w:r>
-      <w:r>
-        <w:rPr>
-          <w:rStyle w:val="VerbatimChar"/>
-        </w:rPr>
-        <w:t xml:space="preserve">buf</w:t>
-      </w:r>
-      <w:r>
-        <w:t xml:space="preserve"> </w:t>
-      </w:r>
-      <w:r>
-        <w:t xml:space="preserve">to file descriptor 1 (</w:t>
-      </w:r>
-      <w:r>
-        <w:rPr>
-          <w:rStyle w:val="VerbatimChar"/>
-        </w:rPr>
-        <w:t xml:space="preserve">stdout</w:t>
-      </w:r>
-      <w:r>
-        <w:t xml:space="preserve">).</w:t>
-      </w:r>
-    </w:p>
-    <w:p>
-      <w:pPr>
-        <w:pStyle w:val="Compact"/>
-        <w:numPr>
-          <w:ilvl w:val="1"/>
-          <w:numId w:val="1007"/>
-        </w:numPr>
-      </w:pPr>
-      <w:r>
-        <w:rPr>
-          <w:rStyle w:val="VerbatimChar"/>
-        </w:rPr>
-        <w:t xml:space="preserve">close(fd)</w:t>
-      </w:r>
-      <w:r>
-        <w:t xml:space="preserve">: Requests the kernel to close the open file descriptor</w:t>
-      </w:r>
-      <w:r>
-        <w:t xml:space="preserve"> </w:t>
-      </w:r>
-      <w:r>
-        <w:rPr>
-          <w:rStyle w:val="VerbatimChar"/>
-        </w:rPr>
-        <w:t xml:space="preserve">fd</w:t>
-      </w:r>
-      <w:r>
-        <w:t xml:space="preserve">, releasing the descriptor table entry and decrementing the file object reference count.</w:t>
-      </w:r>
-    </w:p>
-    <w:p>
-      <w:pPr>
-        <w:pStyle w:val="Compact"/>
-        <w:numPr>
-          <w:ilvl w:val="1"/>
-          <w:numId w:val="1007"/>
-        </w:numPr>
-      </w:pPr>
-      <w:r>
-        <w:rPr>
-          <w:rStyle w:val="VerbatimChar"/>
-        </w:rPr>
-        <w:t xml:space="preserve">exit(status)</w:t>
-      </w:r>
-      <w:r>
-        <w:t xml:space="preserve">: Requests the kernel to terminate the calling process, reclaim its virtual memory and open resources, and report its exit code to the parent process.</w:t>
-      </w:r>
-    </w:p>
-    <w:p>
-      <w:pPr>
-        <w:pStyle w:val="Compact"/>
-        <w:numPr>
-          <w:ilvl w:val="0"/>
-          <w:numId w:val="1006"/>
-        </w:numPr>
-      </w:pPr>
-      <w:r>
-        <w:rPr>
-          <w:b/>
-          <w:bCs/>
-        </w:rPr>
-        <w:t xml:space="preserve">In which kernel file, and on which line, is</w:t>
-      </w:r>
-      <w:r>
-        <w:rPr>
-          <w:b/>
-          <w:bCs/>
-        </w:rPr>
-        <w:t xml:space="preserve"> </w:t>
-      </w:r>
-      <w:r>
-        <w:rPr>
-          <w:rStyle w:val="VerbatimChar"/>
-          <w:b/>
-          <w:bCs/>
-        </w:rPr>
-        <w:t xml:space="preserve">sys_read</w:t>
-      </w:r>
-      <w:r>
-        <w:rPr>
-          <w:b/>
-          <w:bCs/>
-        </w:rPr>
-        <w:t xml:space="preserve"> </w:t>
-      </w:r>
-      <w:r>
-        <w:rPr>
-          <w:b/>
-          <w:bCs/>
-        </w:rPr>
-        <w:t xml:space="preserve">implemented?</w:t>
       </w:r>
     </w:p>
     <w:p>
@@ -2804,19 +2913,12 @@
       </w:pPr>
       <w:r>
         <w:rPr>
-          <w:b/>
-          <w:bCs/>
-        </w:rPr>
-        <w:t xml:space="preserve">File:</w:t>
-      </w:r>
-      <w:r>
-        <w:t xml:space="preserve"> </w:t>
-      </w:r>
-      <w:r>
-        <w:rPr>
-          <w:rStyle w:val="VerbatimChar"/>
-        </w:rPr>
-        <w:t xml:space="preserve">kernel/sysfile.c</w:t>
+          <w:rStyle w:val="VerbatimChar"/>
+        </w:rPr>
+        <w:t xml:space="preserve">open(argv[i], O_RDONLY)</w:t>
+      </w:r>
+      <w:r>
+        <w:t xml:space="preserve">: Requests the kernel to open the specified file path in read-only mode, allocating an entry in the process’s file descriptor table and returning the integer file descriptor.</w:t>
       </w:r>
     </w:p>
     <w:p>
@@ -2829,6 +2931,226 @@
       </w:pPr>
       <w:r>
         <w:rPr>
+          <w:rStyle w:val="VerbatimChar"/>
+        </w:rPr>
+        <w:t xml:space="preserve">read(fd, buf, sizeof(buf))</w:t>
+      </w:r>
+      <w:r>
+        <w:t xml:space="preserve">: Requests the kernel to read up to 512 bytes of data from the file or stream represented by</w:t>
+      </w:r>
+      <w:r>
+        <w:t xml:space="preserve"> </w:t>
+      </w:r>
+      <w:r>
+        <w:rPr>
+          <w:rStyle w:val="VerbatimChar"/>
+        </w:rPr>
+        <w:t xml:space="preserve">fd</w:t>
+      </w:r>
+      <w:r>
+        <w:t xml:space="preserve"> </w:t>
+      </w:r>
+      <w:r>
+        <w:t xml:space="preserve">into the user-space buffer</w:t>
+      </w:r>
+      <w:r>
+        <w:t xml:space="preserve"> </w:t>
+      </w:r>
+      <w:r>
+        <w:rPr>
+          <w:rStyle w:val="VerbatimChar"/>
+        </w:rPr>
+        <w:t xml:space="preserve">buf</w:t>
+      </w:r>
+      <w:r>
+        <w:t xml:space="preserve">.</w:t>
+      </w:r>
+    </w:p>
+    <w:p>
+      <w:pPr>
+        <w:pStyle w:val="Compact"/>
+        <w:numPr>
+          <w:ilvl w:val="1"/>
+          <w:numId w:val="1008"/>
+        </w:numPr>
+      </w:pPr>
+      <w:r>
+        <w:rPr>
+          <w:rStyle w:val="VerbatimChar"/>
+        </w:rPr>
+        <w:t xml:space="preserve">write(1, buf, n)</w:t>
+      </w:r>
+      <w:r>
+        <w:t xml:space="preserve">: Requests the kernel to transfer</w:t>
+      </w:r>
+      <w:r>
+        <w:t xml:space="preserve"> </w:t>
+      </w:r>
+      <w:r>
+        <w:rPr>
+          <w:rStyle w:val="VerbatimChar"/>
+        </w:rPr>
+        <w:t xml:space="preserve">n</w:t>
+      </w:r>
+      <w:r>
+        <w:t xml:space="preserve"> </w:t>
+      </w:r>
+      <w:r>
+        <w:t xml:space="preserve">bytes from the user buffer</w:t>
+      </w:r>
+      <w:r>
+        <w:t xml:space="preserve"> </w:t>
+      </w:r>
+      <w:r>
+        <w:rPr>
+          <w:rStyle w:val="VerbatimChar"/>
+        </w:rPr>
+        <w:t xml:space="preserve">buf</w:t>
+      </w:r>
+      <w:r>
+        <w:t xml:space="preserve"> </w:t>
+      </w:r>
+      <w:r>
+        <w:t xml:space="preserve">to file descriptor 1 (</w:t>
+      </w:r>
+      <w:r>
+        <w:rPr>
+          <w:rStyle w:val="VerbatimChar"/>
+        </w:rPr>
+        <w:t xml:space="preserve">stdout</w:t>
+      </w:r>
+      <w:r>
+        <w:t xml:space="preserve">).</w:t>
+      </w:r>
+    </w:p>
+    <w:p>
+      <w:pPr>
+        <w:pStyle w:val="Compact"/>
+        <w:numPr>
+          <w:ilvl w:val="1"/>
+          <w:numId w:val="1008"/>
+        </w:numPr>
+      </w:pPr>
+      <w:r>
+        <w:rPr>
+          <w:rStyle w:val="VerbatimChar"/>
+        </w:rPr>
+        <w:t xml:space="preserve">close(fd)</w:t>
+      </w:r>
+      <w:r>
+        <w:t xml:space="preserve">: Requests the kernel to close the open file descriptor</w:t>
+      </w:r>
+      <w:r>
+        <w:t xml:space="preserve"> </w:t>
+      </w:r>
+      <w:r>
+        <w:rPr>
+          <w:rStyle w:val="VerbatimChar"/>
+        </w:rPr>
+        <w:t xml:space="preserve">fd</w:t>
+      </w:r>
+      <w:r>
+        <w:t xml:space="preserve">, releasing the descriptor table entry and decrementing the file object reference count.</w:t>
+      </w:r>
+    </w:p>
+    <w:p>
+      <w:pPr>
+        <w:pStyle w:val="Compact"/>
+        <w:numPr>
+          <w:ilvl w:val="1"/>
+          <w:numId w:val="1008"/>
+        </w:numPr>
+      </w:pPr>
+      <w:r>
+        <w:rPr>
+          <w:rStyle w:val="VerbatimChar"/>
+        </w:rPr>
+        <w:t xml:space="preserve">exit(status)</w:t>
+      </w:r>
+      <w:r>
+        <w:t xml:space="preserve">: Requests the kernel to terminate the calling process, reclaim its virtual memory and open resources, and report its exit code to the parent process.</w:t>
+      </w:r>
+    </w:p>
+    <w:p>
+      <w:pPr>
+        <w:pStyle w:val="Compact"/>
+        <w:numPr>
+          <w:ilvl w:val="0"/>
+          <w:numId w:val="1007"/>
+        </w:numPr>
+      </w:pPr>
+      <w:r>
+        <w:rPr>
+          <w:b/>
+          <w:bCs/>
+        </w:rPr>
+        <w:t xml:space="preserve">In which kernel file, and on which line, is</w:t>
+      </w:r>
+      <w:r>
+        <w:rPr>
+          <w:b/>
+          <w:bCs/>
+        </w:rPr>
+        <w:t xml:space="preserve"> </w:t>
+      </w:r>
+      <w:r>
+        <w:rPr>
+          <w:rStyle w:val="VerbatimChar"/>
+          <w:b/>
+          <w:bCs/>
+        </w:rPr>
+        <w:t xml:space="preserve">sys_read</w:t>
+      </w:r>
+      <w:r>
+        <w:rPr>
+          <w:b/>
+          <w:bCs/>
+        </w:rPr>
+        <w:t xml:space="preserve"> </w:t>
+      </w:r>
+      <w:r>
+        <w:rPr>
+          <w:b/>
+          <w:bCs/>
+        </w:rPr>
+        <w:t xml:space="preserve">implemented?</w:t>
+      </w:r>
+    </w:p>
+    <w:p>
+      <w:pPr>
+        <w:pStyle w:val="Compact"/>
+        <w:numPr>
+          <w:ilvl w:val="1"/>
+          <w:numId w:val="1009"/>
+        </w:numPr>
+      </w:pPr>
+      <w:r>
+        <w:rPr>
+          <w:b/>
+          <w:bCs/>
+        </w:rPr>
+        <w:t xml:space="preserve">File:</w:t>
+      </w:r>
+      <w:r>
+        <w:t xml:space="preserve"> </w:t>
+      </w:r>
+      <w:r>
+        <w:rPr>
+          <w:rStyle w:val="VerbatimChar"/>
+        </w:rPr>
+        <w:t xml:space="preserve">kernel/sysfile.c</w:t>
+      </w:r>
+    </w:p>
+    <w:p>
+      <w:pPr>
+        <w:pStyle w:val="Compact"/>
+        <w:numPr>
+          <w:ilvl w:val="1"/>
+          <w:numId w:val="1009"/>
+        </w:numPr>
+      </w:pPr>
+      <w:r>
+        <w:rPr>
           <w:b/>
           <w:bCs/>
         </w:rPr>
@@ -3321,7 +3643,7 @@
         <w:pStyle w:val="Compact"/>
         <w:numPr>
           <w:ilvl w:val="0"/>
-          <w:numId w:val="1006"/>
+          <w:numId w:val="1007"/>
         </w:numPr>
       </w:pPr>
       <w:r>
@@ -3388,7 +3710,7 @@
         <w:pStyle w:val="Compact"/>
         <w:numPr>
           <w:ilvl w:val="1"/>
-          <w:numId w:val="1009"/>
+          <w:numId w:val="1010"/>
         </w:numPr>
       </w:pPr>
       <w:r>
@@ -3441,13 +3763,11 @@
         </w:pict>
       </w:r>
     </w:p>
-    <w:bookmarkEnd w:id="19"/>
-    <w:bookmarkEnd w:id="20"/>
-    <w:bookmarkStart w:id="25" w:name="_38af6e4f5a34793c81ed25b2a62da9b09163a1d"/>
     <w:p>
       <w:pPr>
         <w:pStyle w:val="Heading2"/>
       </w:pPr>
+      <w:bookmarkStart w:id="23" w:name="_38af6e4f5a34793c81ed25b2a62da9b09163a1d"/>
       <w:r>
         <w:t xml:space="preserve">Part 4. Write Your First xv6 Program (</w:t>
       </w:r>
@@ -3460,15 +3780,17 @@
       <w:r>
         <w:t xml:space="preserve">)</w:t>
       </w:r>
-    </w:p>
-    <w:bookmarkStart w:id="21" w:name="_94271cbb9e511b5aaba007f71e695acf70e3e99"/>
+      <w:bookmarkEnd w:id="23"/>
+    </w:p>
     <w:p>
       <w:pPr>
         <w:pStyle w:val="Heading3"/>
       </w:pPr>
+      <w:bookmarkStart w:id="24" w:name="_94271cbb9e511b5aaba007f71e695acf70e3e99"/>
       <w:r>
         <w:t xml:space="preserve">1. Compilation Error &amp; Root Cause Analysis</w:t>
       </w:r>
+      <w:bookmarkEnd w:id="24"/>
     </w:p>
     <w:p>
       <w:pPr>
@@ -3747,12 +4069,11 @@
         <w:t xml:space="preserve">Use pause</w:t>
       </w:r>
     </w:p>
-    <w:bookmarkEnd w:id="21"/>
-    <w:bookmarkStart w:id="22" w:name="_e108408236a087351a44f959ed5469a9a6fe0c9"/>
     <w:p>
       <w:pPr>
         <w:pStyle w:val="Heading3"/>
       </w:pPr>
+      <w:bookmarkStart w:id="25" w:name="_e108408236a087351a44f959ed5469a9a6fe0c9"/>
       <w:r>
         <w:t xml:space="preserve">2. Implementation:</w:t>
       </w:r>
@@ -3765,6 +4086,7 @@
         </w:rPr>
         <w:t xml:space="preserve">user/sleep.c</w:t>
       </w:r>
+      <w:bookmarkEnd w:id="25"/>
     </w:p>
     <w:p>
       <w:pPr>
@@ -4155,12 +4477,11 @@
         <w:t xml:space="preserve">}</w:t>
       </w:r>
     </w:p>
-    <w:bookmarkEnd w:id="22"/>
-    <w:bookmarkStart w:id="23" w:name="_1b1cbd61be5574fd2afa72486a6a04e585d4473"/>
     <w:p>
       <w:pPr>
         <w:pStyle w:val="Heading3"/>
       </w:pPr>
+      <w:bookmarkStart w:id="26" w:name="_1b1cbd61be5574fd2afa72486a6a04e585d4473"/>
       <w:r>
         <w:t xml:space="preserve">3. Adding</w:t>
       </w:r>
@@ -4188,6 +4509,7 @@
         </w:rPr>
         <w:t xml:space="preserve">Makefile</w:t>
       </w:r>
+      <w:bookmarkEnd w:id="26"/>
     </w:p>
     <w:p>
       <w:pPr>
@@ -4427,15 +4749,15 @@
         <w:t xml:space="preserve">    ...</w:t>
       </w:r>
     </w:p>
-    <w:bookmarkEnd w:id="23"/>
-    <w:bookmarkStart w:id="24" w:name="_c050f068f5b55ad0f038ab232a969a996e20ef5"/>
     <w:p>
       <w:pPr>
         <w:pStyle w:val="Heading3"/>
       </w:pPr>
+      <w:bookmarkStart w:id="27" w:name="_c050f068f5b55ad0f038ab232a969a996e20ef5"/>
       <w:r>
         <w:t xml:space="preserve">4. Verification in xv6</w:t>
       </w:r>
+      <w:bookmarkEnd w:id="27"/>
     </w:p>
     <w:p>
       <w:pPr>
@@ -4536,26 +4858,162 @@
         </w:pict>
       </w:r>
     </w:p>
-    <w:bookmarkEnd w:id="24"/>
-    <w:bookmarkEnd w:id="25"/>
-    <w:bookmarkStart w:id="30" w:name="_e970d0b4ce6858b9e1e69132aa07e5d63186d03"/>
     <w:p>
       <w:pPr>
         <w:pStyle w:val="Heading2"/>
       </w:pPr>
+      <w:bookmarkStart w:id="28" w:name="_conclusions"/>
+      <w:r>
+        <w:t xml:space="preserve">Conclusions</w:t>
+      </w:r>
+      <w:bookmarkEnd w:id="28"/>
+    </w:p>
+    <w:p>
+      <w:pPr>
+        <w:pStyle w:val="FirstParagraph"/>
+      </w:pPr>
+      <w:r>
+        <w:t xml:space="preserve">In this laboratory work, we initialized and explored the educational xv6 operating system on the RISC-V 64-bit architecture.</w:t>
+      </w:r>
+    </w:p>
+    <w:p>
+      <w:pPr>
+        <w:pStyle w:val="BodyText"/>
+      </w:pPr>
+      <w:r>
+        <w:t xml:space="preserve">We observed firsthand the strict boundary dividing privileged Supervisor mode (</w:t>
+      </w:r>
+      <w:r>
+        <w:rPr>
+          <w:rStyle w:val="VerbatimChar"/>
+        </w:rPr>
+        <w:t xml:space="preserve">kernel/</w:t>
+      </w:r>
+      <w:r>
+        <w:t xml:space="preserve">) from unprivileged User mode (</w:t>
+      </w:r>
+      <w:r>
+        <w:rPr>
+          <w:rStyle w:val="VerbatimChar"/>
+        </w:rPr>
+        <w:t xml:space="preserve">user/</w:t>
+      </w:r>
+      <w:r>
+        <w:t xml:space="preserve">), learning that all user-level requests for hardware or kernel state must traverse the</w:t>
+      </w:r>
+      <w:r>
+        <w:t xml:space="preserve"> </w:t>
+      </w:r>
+      <w:r>
+        <w:rPr>
+          <w:rStyle w:val="VerbatimChar"/>
+        </w:rPr>
+        <w:t xml:space="preserve">ecall</w:t>
+      </w:r>
+      <w:r>
+        <w:t xml:space="preserve"> </w:t>
+      </w:r>
+      <w:r>
+        <w:t xml:space="preserve">trap mechanism and system call routing table (</w:t>
+      </w:r>
+      <w:r>
+        <w:rPr>
+          <w:rStyle w:val="VerbatimChar"/>
+        </w:rPr>
+        <w:t xml:space="preserve">syscall.c</w:t>
+      </w:r>
+      <w:r>
+        <w:t xml:space="preserve">). Furthermore, we confirmed the modularity of Unix process abstraction by using pipelines within xv6, which required concurrent process scheduling and kernel-managed IPC buffers. Finally, we resolved kernel API version differences by adapting</w:t>
+      </w:r>
+      <w:r>
+        <w:t xml:space="preserve"> </w:t>
+      </w:r>
+      <w:r>
+        <w:rPr>
+          <w:rStyle w:val="VerbatimChar"/>
+        </w:rPr>
+        <w:t xml:space="preserve">user/sleep.c</w:t>
+      </w:r>
+      <w:r>
+        <w:t xml:space="preserve"> </w:t>
+      </w:r>
+      <w:r>
+        <w:t xml:space="preserve">to use</w:t>
+      </w:r>
+      <w:r>
+        <w:t xml:space="preserve"> </w:t>
+      </w:r>
+      <w:r>
+        <w:rPr>
+          <w:rStyle w:val="VerbatimChar"/>
+        </w:rPr>
+        <w:t xml:space="preserve">pause()</w:t>
+      </w:r>
+      <w:r>
+        <w:t xml:space="preserve"> </w:t>
+      </w:r>
+      <w:r>
+        <w:t xml:space="preserve">instead of</w:t>
+      </w:r>
+      <w:r>
+        <w:t xml:space="preserve"> </w:t>
+      </w:r>
+      <w:r>
+        <w:rPr>
+          <w:rStyle w:val="VerbatimChar"/>
+        </w:rPr>
+        <w:t xml:space="preserve">sleep()</w:t>
+      </w:r>
+      <w:r>
+        <w:t xml:space="preserve">, successfully integrated the binary into the</w:t>
+      </w:r>
+      <w:r>
+        <w:t xml:space="preserve"> </w:t>
+      </w:r>
+      <w:r>
+        <w:rPr>
+          <w:rStyle w:val="VerbatimChar"/>
+        </w:rPr>
+        <w:t xml:space="preserve">Makefile</w:t>
+      </w:r>
+      <w:r>
+        <w:t xml:space="preserve">’s</w:t>
+      </w:r>
+      <w:r>
+        <w:t xml:space="preserve"> </w:t>
+      </w:r>
+      <w:r>
+        <w:rPr>
+          <w:rStyle w:val="VerbatimChar"/>
+        </w:rPr>
+        <w:t xml:space="preserve">UPROGS</w:t>
+      </w:r>
+      <w:r>
+        <w:t xml:space="preserve"> </w:t>
+      </w:r>
+      <w:r>
+        <w:t xml:space="preserve">image generator, and validated its execution in QEMU.</w:t>
+      </w:r>
+    </w:p>
+    <w:p>
+      <w:pPr>
+        <w:pStyle w:val="Heading2"/>
+      </w:pPr>
+      <w:bookmarkStart w:id="29" w:name="_e970d0b4ce6858b9e1e69132aa07e5d63186d03"/>
       <w:r>
         <w:t xml:space="preserve">Deliverables Checklist</w:t>
       </w:r>
+      <w:bookmarkEnd w:id="29"/>
     </w:p>
     <w:p>
       <w:pPr>
         <w:pStyle w:val="FirstParagraph"/>
         <w:numPr>
           <w:ilvl w:val="0"/>
-          <w:numId w:val="1010"/>
+          <w:numId w:val="1011"/>
         </w:numPr>
       </w:pPr>
-      <w:hyperlink r:id="rId26">
+      <w:hyperlink r:id="rId30">
         <w:r>
           <w:rPr>
             <w:rStyle w:val="Hyperlink"/>
@@ -4572,10 +5030,10 @@
         <w:pStyle w:val="FirstParagraph"/>
         <w:numPr>
           <w:ilvl w:val="0"/>
-          <w:numId w:val="1011"/>
+          <w:numId w:val="1012"/>
         </w:numPr>
       </w:pPr>
-      <w:hyperlink r:id="rId27">
+      <w:hyperlink r:id="rId31">
         <w:r>
           <w:rPr>
             <w:rStyle w:val="Hyperlink"/>
@@ -4619,10 +5077,10 @@
         <w:pStyle w:val="FirstParagraph"/>
         <w:numPr>
           <w:ilvl w:val="0"/>
-          <w:numId w:val="1012"/>
+          <w:numId w:val="1013"/>
         </w:numPr>
       </w:pPr>
-      <w:hyperlink r:id="rId28">
+      <w:hyperlink r:id="rId32">
         <w:r>
           <w:rPr>
             <w:rStyle w:val="Hyperlink"/>
@@ -4639,10 +5097,10 @@
         <w:pStyle w:val="FirstParagraph"/>
         <w:numPr>
           <w:ilvl w:val="0"/>
-          <w:numId w:val="1013"/>
+          <w:numId w:val="1014"/>
         </w:numPr>
       </w:pPr>
-      <w:hyperlink r:id="rId29">
+      <w:hyperlink r:id="rId33">
         <w:r>
           <w:rPr>
             <w:rStyle w:val="Hyperlink"/>
@@ -4654,8 +5112,6 @@
         <w:t xml:space="preserve">: Full comprehensive laboratory report.</w:t>
       </w:r>
     </w:p>
-    <w:bookmarkEnd w:id="30"/>
-    <w:bookmarkEnd w:id="31"/>
     <w:sectPr>
       <w:footnotePr>
         <w:numRestart w:val="eachSect"/>
@@ -5067,15 +5523,6 @@
     </w:lvlOverride>
   </w:num>
   <w:num w:numId="1003">
-    <w:abstractNumId w:val="991"/>
-  </w:num>
-  <w:num w:numId="1004">
-    <w:abstractNumId w:val="991"/>
-  </w:num>
-  <w:num w:numId="1005">
-    <w:abstractNumId w:val="991"/>
-  </w:num>
-  <w:num w:numId="1006">
     <w:abstractNumId w:val="99411"/>
     <w:lvlOverride w:ilvl="0">
       <w:startOverride w:val="1"/>
@@ -5105,8 +5552,44 @@
       <w:startOverride w:val="1"/>
     </w:lvlOverride>
   </w:num>
+  <w:num w:numId="1004">
+    <w:abstractNumId w:val="991"/>
+  </w:num>
+  <w:num w:numId="1005">
+    <w:abstractNumId w:val="991"/>
+  </w:num>
+  <w:num w:numId="1006">
+    <w:abstractNumId w:val="991"/>
+  </w:num>
   <w:num w:numId="1007">
-    <w:abstractNumId w:val="991"/>
+    <w:abstractNumId w:val="99411"/>
+    <w:lvlOverride w:ilvl="0">
+      <w:startOverride w:val="1"/>
+    </w:lvlOverride>
+    <w:lvlOverride w:ilvl="1">
+      <w:startOverride w:val="1"/>
+    </w:lvlOverride>
+    <w:lvlOverride w:ilvl="2">
+      <w:startOverride w:val="1"/>
+    </w:lvlOverride>
+    <w:lvlOverride w:ilvl="3">
+      <w:startOverride w:val="1"/>
+    </w:lvlOverride>
+    <w:lvlOverride w:ilvl="4">
+      <w:startOverride w:val="1"/>
+    </w:lvlOverride>
+    <w:lvlOverride w:ilvl="5">
+      <w:startOverride w:val="1"/>
+    </w:lvlOverride>
+    <w:lvlOverride w:ilvl="6">
+      <w:startOverride w:val="1"/>
+    </w:lvlOverride>
+    <w:lvlOverride w:ilvl="7">
+      <w:startOverride w:val="1"/>
+    </w:lvlOverride>
+    <w:lvlOverride w:ilvl="8">
+      <w:startOverride w:val="1"/>
+    </w:lvlOverride>
   </w:num>
   <w:num w:numId="1008">
     <w:abstractNumId w:val="991"/>
@@ -5115,7 +5598,7 @@
     <w:abstractNumId w:val="991"/>
   </w:num>
   <w:num w:numId="1010">
-    <w:abstractNumId w:val="993"/>
+    <w:abstractNumId w:val="991"/>
   </w:num>
   <w:num w:numId="1011">
     <w:abstractNumId w:val="993"/>
@@ -5126,6 +5609,9 @@
   <w:num w:numId="1013">
     <w:abstractNumId w:val="993"/>
   </w:num>
+  <w:num w:numId="1014">
+    <w:abstractNumId w:val="993"/>
+  </w:num>
 </w:numbering>
 </file>
 
@@ -5134,10 +5620,10 @@
   <w:docDefaults>
     <w:rPrDefault>
       <w:rPr>
-        <w:rFonts w:asciiTheme="minorHAnsi" w:cstheme="minorBidi" w:eastAsiaTheme="minorEastAsia" w:hAnsiTheme="minorHAnsi"/>
+        <w:rFonts w:asciiTheme="minorHAnsi" w:eastAsiaTheme="minorEastAsia" w:hAnsiTheme="minorHAnsi" w:cstheme="minorBidi"/>
         <w:sz w:val="24"/>
         <w:szCs w:val="24"/>
-        <w:lang w:bidi="ar-SA" w:eastAsia="zh-CN" w:val="en-US"/>
+        <w:lang w:val="en-US" w:eastAsia="zh-CN" w:bidi="ar-SA"/>
       </w:rPr>
     </w:rPrDefault>
     <w:pPrDefault>
@@ -5146,35 +5632,35 @@
       </w:pPr>
     </w:pPrDefault>
   </w:docDefaults>
-  <w:latentStyles w:count="276" w:defLockedState="0" w:defQFormat="0" w:defSemiHidden="0" w:defUIPriority="0" w:defUnhideWhenUsed="0"/>
-  <w:style w:default="1" w:styleId="Normal" w:type="paragraph">
+  <w:latentStyles w:defLockedState="0" w:defUIPriority="0" w:defSemiHidden="0" w:defUnhideWhenUsed="0" w:defQFormat="0" w:count="276"/>
+  <w:style w:type="paragraph" w:default="1" w:styleId="Normal">
     <w:name w:val="Normal"/>
     <w:qFormat/>
   </w:style>
-  <w:style w:styleId="BodyText" w:type="paragraph">
+  <w:style w:type="paragraph" w:styleId="BodyText">
     <w:name w:val="Body Text"/>
     <w:basedOn w:val="Normal"/>
     <w:link w:val="BodyTextChar"/>
     <w:qFormat/>
     <w:pPr>
-      <w:spacing w:after="180" w:before="180"/>
+      <w:spacing w:before="180" w:after="180"/>
     </w:pPr>
   </w:style>
-  <w:style w:customStyle="1" w:styleId="FirstParagraph" w:type="paragraph">
+  <w:style w:type="paragraph" w:customStyle="1" w:styleId="FirstParagraph">
     <w:name w:val="First Paragraph"/>
     <w:basedOn w:val="BodyText"/>
     <w:next w:val="BodyText"/>
     <w:qFormat/>
   </w:style>
-  <w:style w:customStyle="1" w:styleId="Compact" w:type="paragraph">
+  <w:style w:type="paragraph" w:customStyle="1" w:styleId="Compact">
     <w:name w:val="Compact"/>
     <w:basedOn w:val="BodyText"/>
     <w:qFormat/>
     <w:pPr>
-      <w:spacing w:after="36" w:before="36"/>
+      <w:spacing w:before="36" w:after="36"/>
     </w:pPr>
   </w:style>
-  <w:style w:styleId="Title" w:type="paragraph">
+  <w:style w:type="paragraph" w:styleId="Title">
     <w:name w:val="Title"/>
     <w:basedOn w:val="Normal"/>
     <w:next w:val="BodyText"/>
@@ -5188,24 +5674,24 @@
       <w:jc w:val="center"/>
     </w:pPr>
     <w:rPr>
-      <w:rFonts w:asciiTheme="majorHAnsi" w:cstheme="majorBidi" w:eastAsiaTheme="majorEastAsia" w:hAnsiTheme="majorHAnsi"/>
+      <w:rFonts w:asciiTheme="majorHAnsi" w:eastAsiaTheme="majorEastAsia" w:hAnsiTheme="majorHAnsi" w:cstheme="majorBidi"/>
       <w:sz w:val="56"/>
       <w:szCs w:val="56"/>
     </w:rPr>
   </w:style>
-  <w:style w:customStyle="1" w:styleId="TitleChar" w:type="character">
+  <w:style w:type="character" w:customStyle="1" w:styleId="TitleChar">
     <w:name w:val="Title Char"/>
     <w:basedOn w:val="DefaultParagraphFont"/>
     <w:link w:val="Title"/>
     <w:uiPriority w:val="10"/>
     <w:rsid w:val="00A10FD9"/>
     <w:rPr>
-      <w:rFonts w:asciiTheme="majorHAnsi" w:cstheme="majorBidi" w:eastAsiaTheme="majorEastAsia" w:hAnsiTheme="majorHAnsi"/>
+      <w:rFonts w:asciiTheme="majorHAnsi" w:eastAsiaTheme="majorEastAsia" w:hAnsiTheme="majorHAnsi" w:cstheme="majorBidi"/>
       <w:sz w:val="56"/>
       <w:szCs w:val="56"/>
     </w:rPr>
   </w:style>
-  <w:style w:styleId="Subtitle" w:type="paragraph">
+  <w:style w:type="paragraph" w:styleId="Subtitle">
     <w:name w:val="Subtitle"/>
     <w:basedOn w:val="Title"/>
     <w:next w:val="BodyText"/>
@@ -5219,27 +5705,27 @@
       </w:numPr>
     </w:pPr>
     <w:rPr>
-      <w:rFonts w:cstheme="majorBidi" w:eastAsiaTheme="majorEastAsia"/>
+      <w:rFonts w:eastAsiaTheme="majorEastAsia" w:cstheme="majorBidi"/>
       <w:spacing w:val="15"/>
       <w:sz w:val="28"/>
       <w:szCs w:val="28"/>
     </w:rPr>
   </w:style>
-  <w:style w:customStyle="1" w:styleId="SubtitleChar" w:type="character">
+  <w:style w:type="character" w:customStyle="1" w:styleId="SubtitleChar">
     <w:name w:val="Subtitle Char"/>
     <w:basedOn w:val="DefaultParagraphFont"/>
     <w:link w:val="Subtitle"/>
     <w:uiPriority w:val="11"/>
     <w:rsid w:val="00A10FD9"/>
     <w:rPr>
-      <w:rFonts w:cstheme="majorBidi" w:eastAsiaTheme="majorEastAsia"/>
-      <w:color w:themeColor="text1" w:themeTint="A6" w:val="595959"/>
+      <w:rFonts w:eastAsiaTheme="majorEastAsia" w:cstheme="majorBidi"/>
+      <w:color w:val="595959" w:themeColor="text1" w:themeTint="A6"/>
       <w:spacing w:val="15"/>
       <w:sz w:val="28"/>
       <w:szCs w:val="28"/>
     </w:rPr>
   </w:style>
-  <w:style w:customStyle="1" w:styleId="Author" w:type="paragraph">
+  <w:style w:type="paragraph" w:customStyle="1" w:styleId="Author">
     <w:name w:val="Author"/>
     <w:basedOn w:val="Title"/>
     <w:next w:val="BodyText"/>
@@ -5253,7 +5739,7 @@
       <w:szCs w:val="24"/>
     </w:rPr>
   </w:style>
-  <w:style w:styleId="Date" w:type="paragraph">
+  <w:style w:type="paragraph" w:styleId="Date">
     <w:name w:val="Date"/>
     <w:basedOn w:val="Title"/>
     <w:next w:val="BodyText"/>
@@ -5267,7 +5753,7 @@
       <w:szCs w:val="24"/>
     </w:rPr>
   </w:style>
-  <w:style w:customStyle="1" w:styleId="AbstractTitle" w:type="paragraph">
+  <w:style w:type="paragraph" w:customStyle="1" w:styleId="AbstractTitle">
     <w:name w:val="Abstract Title"/>
     <w:basedOn w:val="Normal"/>
     <w:next w:val="Abstract"/>
@@ -5275,7 +5761,7 @@
     <w:pPr>
       <w:keepNext/>
       <w:keepLines/>
-      <w:spacing w:after="0" w:before="300"/>
+      <w:spacing w:before="300" w:after="0"/>
       <w:jc w:val="center"/>
     </w:pPr>
     <w:rPr>
@@ -5284,7 +5770,7 @@
       <w:szCs w:val="20"/>
     </w:rPr>
   </w:style>
-  <w:style w:customStyle="1" w:styleId="Abstract" w:type="paragraph">
+  <w:style w:type="paragraph" w:customStyle="1" w:styleId="Abstract">
     <w:name w:val="Abstract"/>
     <w:basedOn w:val="Normal"/>
     <w:next w:val="BodyText"/>
@@ -5292,14 +5778,14 @@
     <w:pPr>
       <w:keepNext/>
       <w:keepLines/>
-      <w:spacing w:after="300" w:before="100"/>
+      <w:spacing w:before="100" w:after="300"/>
     </w:pPr>
     <w:rPr>
       <w:sz w:val="20"/>
       <w:szCs w:val="20"/>
     </w:rPr>
   </w:style>
-  <w:style w:styleId="Bibliography" w:type="paragraph">
+  <w:style w:type="paragraph" w:styleId="Bibliography">
     <w:name w:val="Bibliography"/>
     <w:basedOn w:val="Normal"/>
     <w:next w:val="Bibliography"/>
@@ -5307,7 +5793,7 @@
     <w:pPr/>
     <w:rPr/>
   </w:style>
-  <w:style w:styleId="Heading1" w:type="paragraph">
+  <w:style w:type="paragraph" w:styleId="Heading1">
     <w:name w:val="heading 1"/>
     <w:basedOn w:val="Normal"/>
     <w:next w:val="BodyText"/>
@@ -5318,17 +5804,17 @@
     <w:pPr>
       <w:keepNext/>
       <w:keepLines/>
-      <w:spacing w:after="80" w:before="360"/>
+      <w:spacing w:before="360" w:after="80"/>
       <w:outlineLvl w:val="0"/>
     </w:pPr>
     <w:rPr>
-      <w:rFonts w:asciiTheme="majorHAnsi" w:cstheme="majorBidi" w:eastAsiaTheme="majorEastAsia" w:hAnsiTheme="majorHAnsi"/>
-      <w:color w:themeColor="accent1" w:themeShade="BF" w:val="0F4761"/>
+      <w:rFonts w:asciiTheme="majorHAnsi" w:eastAsiaTheme="majorEastAsia" w:hAnsiTheme="majorHAnsi" w:cstheme="majorBidi"/>
+      <w:color w:val="0F4761" w:themeColor="accent1" w:themeShade="BF"/>
       <w:sz w:val="40"/>
       <w:szCs w:val="40"/>
     </w:rPr>
   </w:style>
-  <w:style w:styleId="Heading2" w:type="paragraph">
+  <w:style w:type="paragraph" w:styleId="Heading2">
     <w:name w:val="heading 2"/>
     <w:basedOn w:val="Normal"/>
     <w:next w:val="BodyText"/>
@@ -5341,17 +5827,17 @@
     <w:pPr>
       <w:keepNext/>
       <w:keepLines/>
-      <w:spacing w:after="80" w:before="160"/>
+      <w:spacing w:before="160" w:after="80"/>
       <w:outlineLvl w:val="1"/>
     </w:pPr>
     <w:rPr>
-      <w:rFonts w:asciiTheme="majorHAnsi" w:cstheme="majorBidi" w:eastAsiaTheme="majorEastAsia" w:hAnsiTheme="majorHAnsi"/>
-      <w:color w:themeColor="accent1" w:themeShade="BF" w:val="0F4761"/>
+      <w:rFonts w:asciiTheme="majorHAnsi" w:eastAsiaTheme="majorEastAsia" w:hAnsiTheme="majorHAnsi" w:cstheme="majorBidi"/>
+      <w:color w:val="0F4761" w:themeColor="accent1" w:themeShade="BF"/>
       <w:sz w:val="32"/>
       <w:szCs w:val="32"/>
     </w:rPr>
   </w:style>
-  <w:style w:styleId="Heading3" w:type="paragraph">
+  <w:style w:type="paragraph" w:styleId="Heading3">
     <w:name w:val="heading 3"/>
     <w:basedOn w:val="Normal"/>
     <w:next w:val="BodyText"/>
@@ -5364,17 +5850,17 @@
     <w:pPr>
       <w:keepNext/>
       <w:keepLines/>
-      <w:spacing w:after="80" w:before="160"/>
+      <w:spacing w:before="160" w:after="80"/>
       <w:outlineLvl w:val="2"/>
     </w:pPr>
     <w:rPr>
-      <w:rFonts w:cstheme="majorBidi" w:eastAsiaTheme="majorEastAsia"/>
-      <w:color w:themeColor="accent1" w:themeShade="BF" w:val="0F4761"/>
+      <w:rFonts w:eastAsiaTheme="majorEastAsia" w:cstheme="majorBidi"/>
+      <w:color w:val="0F4761" w:themeColor="accent1" w:themeShade="BF"/>
       <w:sz w:val="28"/>
       <w:szCs w:val="28"/>
     </w:rPr>
   </w:style>
-  <w:style w:styleId="Heading4" w:type="paragraph">
+  <w:style w:type="paragraph" w:styleId="Heading4">
     <w:name w:val="heading 4"/>
     <w:basedOn w:val="Normal"/>
     <w:next w:val="BodyText"/>
@@ -5387,17 +5873,17 @@
     <w:pPr>
       <w:keepNext/>
       <w:keepLines/>
-      <w:spacing w:after="40" w:before="80"/>
+      <w:spacing w:before="80" w:after="40"/>
       <w:outlineLvl w:val="3"/>
     </w:pPr>
     <w:rPr>
-      <w:rFonts w:cstheme="majorBidi" w:eastAsiaTheme="majorEastAsia"/>
+      <w:rFonts w:eastAsiaTheme="majorEastAsia" w:cstheme="majorBidi"/>
       <w:i/>
       <w:iCs/>
-      <w:color w:themeColor="accent1" w:themeShade="BF" w:val="0F4761"/>
+      <w:color w:val="0F4761" w:themeColor="accent1" w:themeShade="BF"/>
     </w:rPr>
   </w:style>
-  <w:style w:styleId="Heading5" w:type="paragraph">
+  <w:style w:type="paragraph" w:styleId="Heading5">
     <w:name w:val="heading 5"/>
     <w:basedOn w:val="Normal"/>
     <w:next w:val="BodyText"/>
@@ -5410,15 +5896,15 @@
     <w:pPr>
       <w:keepNext/>
       <w:keepLines/>
-      <w:spacing w:after="40" w:before="80"/>
+      <w:spacing w:before="80" w:after="40"/>
       <w:outlineLvl w:val="4"/>
     </w:pPr>
     <w:rPr>
-      <w:rFonts w:cstheme="majorBidi" w:eastAsiaTheme="majorEastAsia"/>
-      <w:color w:themeColor="accent1" w:themeShade="BF" w:val="0F4761"/>
+      <w:rFonts w:eastAsiaTheme="majorEastAsia" w:cstheme="majorBidi"/>
+      <w:color w:val="0F4761" w:themeColor="accent1" w:themeShade="BF"/>
     </w:rPr>
   </w:style>
-  <w:style w:styleId="Heading6" w:type="paragraph">
+  <w:style w:type="paragraph" w:styleId="Heading6">
     <w:name w:val="heading 6"/>
     <w:basedOn w:val="Normal"/>
     <w:next w:val="BodyText"/>
@@ -5431,17 +5917,17 @@
     <w:pPr>
       <w:keepNext/>
       <w:keepLines/>
-      <w:spacing w:after="0" w:before="40"/>
+      <w:spacing w:before="40" w:after="0"/>
       <w:outlineLvl w:val="5"/>
     </w:pPr>
     <w:rPr>
-      <w:rFonts w:cstheme="majorBidi" w:eastAsiaTheme="majorEastAsia"/>
+      <w:rFonts w:eastAsiaTheme="majorEastAsia" w:cstheme="majorBidi"/>
       <w:i/>
       <w:iCs/>
-      <w:color w:themeColor="text1" w:themeTint="A6" w:val="595959"/>
+      <w:color w:val="595959" w:themeColor="text1" w:themeTint="A6"/>
     </w:rPr>
   </w:style>
-  <w:style w:styleId="Heading7" w:type="paragraph">
+  <w:style w:type="paragraph" w:styleId="Heading7">
     <w:name w:val="heading 7"/>
     <w:basedOn w:val="Normal"/>
     <w:next w:val="BodyText"/>
@@ -5454,15 +5940,15 @@
     <w:pPr>
       <w:keepNext/>
       <w:keepLines/>
-      <w:spacing w:after="0" w:before="40"/>
+      <w:spacing w:before="40" w:after="0"/>
       <w:outlineLvl w:val="6"/>
     </w:pPr>
     <w:rPr>
-      <w:rFonts w:cstheme="majorBidi" w:eastAsiaTheme="majorEastAsia"/>
-      <w:color w:themeColor="text1" w:themeTint="A6" w:val="595959"/>
+      <w:rFonts w:eastAsiaTheme="majorEastAsia" w:cstheme="majorBidi"/>
+      <w:color w:val="595959" w:themeColor="text1" w:themeTint="A6"/>
     </w:rPr>
   </w:style>
-  <w:style w:styleId="Heading8" w:type="paragraph">
+  <w:style w:type="paragraph" w:styleId="Heading8">
     <w:name w:val="heading 8"/>
     <w:basedOn w:val="Normal"/>
     <w:next w:val="BodyText"/>
@@ -5479,13 +5965,13 @@
       <w:outlineLvl w:val="7"/>
     </w:pPr>
     <w:rPr>
-      <w:rFonts w:cstheme="majorBidi" w:eastAsiaTheme="majorEastAsia"/>
+      <w:rFonts w:eastAsiaTheme="majorEastAsia" w:cstheme="majorBidi"/>
       <w:i/>
       <w:iCs/>
-      <w:color w:themeColor="text1" w:themeTint="D8" w:val="272727"/>
+      <w:color w:val="272727" w:themeColor="text1" w:themeTint="D8"/>
     </w:rPr>
   </w:style>
-  <w:style w:styleId="Heading9" w:type="paragraph">
+  <w:style w:type="paragraph" w:styleId="Heading9">
     <w:name w:val="heading 9"/>
     <w:basedOn w:val="Normal"/>
     <w:next w:val="BodyText"/>
@@ -5502,24 +5988,24 @@
       <w:outlineLvl w:val="8"/>
     </w:pPr>
     <w:rPr>
-      <w:rFonts w:cstheme="majorBidi" w:eastAsiaTheme="majorEastAsia"/>
-      <w:color w:themeColor="text1" w:themeTint="D8" w:val="272727"/>
+      <w:rFonts w:eastAsiaTheme="majorEastAsia" w:cstheme="majorBidi"/>
+      <w:color w:val="272727" w:themeColor="text1" w:themeTint="D8"/>
     </w:rPr>
   </w:style>
-  <w:style w:customStyle="1" w:styleId="Heading1Char" w:type="character">
+  <w:style w:type="character" w:customStyle="1" w:styleId="Heading1Char">
     <w:name w:val="Heading 1 Char"/>
     <w:basedOn w:val="DefaultParagraphFont"/>
     <w:link w:val="Heading1"/>
     <w:uiPriority w:val="9"/>
     <w:rsid w:val="00A10FD9"/>
     <w:rPr>
-      <w:rFonts w:asciiTheme="majorHAnsi" w:cstheme="majorBidi" w:eastAsiaTheme="majorEastAsia" w:hAnsiTheme="majorHAnsi"/>
-      <w:color w:themeColor="accent1" w:themeShade="BF" w:val="0F4761"/>
+      <w:rFonts w:asciiTheme="majorHAnsi" w:eastAsiaTheme="majorEastAsia" w:hAnsiTheme="majorHAnsi" w:cstheme="majorBidi"/>
+      <w:color w:val="0F4761" w:themeColor="accent1" w:themeShade="BF"/>
       <w:sz w:val="40"/>
       <w:szCs w:val="40"/>
     </w:rPr>
   </w:style>
-  <w:style w:customStyle="1" w:styleId="Heading2Char" w:type="character">
+  <w:style w:type="character" w:customStyle="1" w:styleId="Heading2Char">
     <w:name w:val="Heading 2 Char"/>
     <w:basedOn w:val="DefaultParagraphFont"/>
     <w:link w:val="Heading2"/>
@@ -5527,13 +6013,13 @@
     <w:semiHidden/>
     <w:rsid w:val="00A10FD9"/>
     <w:rPr>
-      <w:rFonts w:asciiTheme="majorHAnsi" w:cstheme="majorBidi" w:eastAsiaTheme="majorEastAsia" w:hAnsiTheme="majorHAnsi"/>
-      <w:color w:themeColor="accent1" w:themeShade="BF" w:val="0F4761"/>
+      <w:rFonts w:asciiTheme="majorHAnsi" w:eastAsiaTheme="majorEastAsia" w:hAnsiTheme="majorHAnsi" w:cstheme="majorBidi"/>
+      <w:color w:val="0F4761" w:themeColor="accent1" w:themeShade="BF"/>
       <w:sz w:val="32"/>
       <w:szCs w:val="32"/>
     </w:rPr>
   </w:style>
-  <w:style w:customStyle="1" w:styleId="Heading3Char" w:type="character">
+  <w:style w:type="character" w:customStyle="1" w:styleId="Heading3Char">
     <w:name w:val="Heading 3 Char"/>
     <w:basedOn w:val="DefaultParagraphFont"/>
     <w:link w:val="Heading3"/>
@@ -5541,13 +6027,13 @@
     <w:semiHidden/>
     <w:rsid w:val="00A10FD9"/>
     <w:rPr>
-      <w:rFonts w:cstheme="majorBidi" w:eastAsiaTheme="majorEastAsia"/>
-      <w:color w:themeColor="accent1" w:themeShade="BF" w:val="0F4761"/>
+      <w:rFonts w:eastAsiaTheme="majorEastAsia" w:cstheme="majorBidi"/>
+      <w:color w:val="0F4761" w:themeColor="accent1" w:themeShade="BF"/>
       <w:sz w:val="28"/>
       <w:szCs w:val="28"/>
     </w:rPr>
   </w:style>
-  <w:style w:customStyle="1" w:styleId="Heading4Char" w:type="character">
+  <w:style w:type="character" w:customStyle="1" w:styleId="Heading4Char">
     <w:name w:val="Heading 4 Char"/>
     <w:basedOn w:val="DefaultParagraphFont"/>
     <w:link w:val="Heading4"/>
@@ -5555,13 +6041,13 @@
     <w:semiHidden/>
     <w:rsid w:val="00A10FD9"/>
     <w:rPr>
-      <w:rFonts w:cstheme="majorBidi" w:eastAsiaTheme="majorEastAsia"/>
+      <w:rFonts w:eastAsiaTheme="majorEastAsia" w:cstheme="majorBidi"/>
       <w:i/>
       <w:iCs/>
-      <w:color w:themeColor="accent1" w:themeShade="BF" w:val="0F4761"/>
+      <w:color w:val="0F4761" w:themeColor="accent1" w:themeShade="BF"/>
     </w:rPr>
   </w:style>
-  <w:style w:customStyle="1" w:styleId="Heading5Char" w:type="character">
+  <w:style w:type="character" w:customStyle="1" w:styleId="Heading5Char">
     <w:name w:val="Heading 5 Char"/>
     <w:basedOn w:val="DefaultParagraphFont"/>
     <w:link w:val="Heading5"/>
@@ -5569,11 +6055,11 @@
     <w:semiHidden/>
     <w:rsid w:val="00A10FD9"/>
     <w:rPr>
-      <w:rFonts w:cstheme="majorBidi" w:eastAsiaTheme="majorEastAsia"/>
-      <w:color w:themeColor="accent1" w:themeShade="BF" w:val="0F4761"/>
+      <w:rFonts w:eastAsiaTheme="majorEastAsia" w:cstheme="majorBidi"/>
+      <w:color w:val="0F4761" w:themeColor="accent1" w:themeShade="BF"/>
     </w:rPr>
   </w:style>
-  <w:style w:customStyle="1" w:styleId="Heading6Char" w:type="character">
+  <w:style w:type="character" w:customStyle="1" w:styleId="Heading6Char">
     <w:name w:val="Heading 6 Char"/>
     <w:basedOn w:val="DefaultParagraphFont"/>
     <w:link w:val="Heading6"/>
@@ -5581,13 +6067,13 @@
     <w:semiHidden/>
     <w:rsid w:val="00A10FD9"/>
     <w:rPr>
-      <w:rFonts w:cstheme="majorBidi" w:eastAsiaTheme="majorEastAsia"/>
+      <w:rFonts w:eastAsiaTheme="majorEastAsia" w:cstheme="majorBidi"/>
       <w:i/>
       <w:iCs/>
-      <w:color w:themeColor="text1" w:themeTint="A6" w:val="595959"/>
+      <w:color w:val="595959" w:themeColor="text1" w:themeTint="A6"/>
     </w:rPr>
   </w:style>
-  <w:style w:customStyle="1" w:styleId="Heading7Char" w:type="character">
+  <w:style w:type="character" w:customStyle="1" w:styleId="Heading7Char">
     <w:name w:val="Heading 7 Char"/>
     <w:basedOn w:val="DefaultParagraphFont"/>
     <w:link w:val="Heading7"/>
@@ -5595,11 +6081,11 @@
     <w:semiHidden/>
     <w:rsid w:val="00A10FD9"/>
     <w:rPr>
-      <w:rFonts w:cstheme="majorBidi" w:eastAsiaTheme="majorEastAsia"/>
-      <w:color w:themeColor="text1" w:themeTint="A6" w:val="595959"/>
+      <w:rFonts w:eastAsiaTheme="majorEastAsia" w:cstheme="majorBidi"/>
+      <w:color w:val="595959" w:themeColor="text1" w:themeTint="A6"/>
     </w:rPr>
   </w:style>
-  <w:style w:customStyle="1" w:styleId="Heading8Char" w:type="character">
+  <w:style w:type="character" w:customStyle="1" w:styleId="Heading8Char">
     <w:name w:val="Heading 8 Char"/>
     <w:basedOn w:val="DefaultParagraphFont"/>
     <w:link w:val="Heading8"/>
@@ -5607,13 +6093,13 @@
     <w:semiHidden/>
     <w:rsid w:val="00A10FD9"/>
     <w:rPr>
-      <w:rFonts w:cstheme="majorBidi" w:eastAsiaTheme="majorEastAsia"/>
+      <w:rFonts w:eastAsiaTheme="majorEastAsia" w:cstheme="majorBidi"/>
       <w:i/>
       <w:iCs/>
-      <w:color w:themeColor="text1" w:themeTint="D8" w:val="272727"/>
+      <w:color w:val="272727" w:themeColor="text1" w:themeTint="D8"/>
     </w:rPr>
   </w:style>
-  <w:style w:customStyle="1" w:styleId="Heading9Char" w:type="character">
+  <w:style w:type="character" w:customStyle="1" w:styleId="Heading9Char">
     <w:name w:val="Heading 9 Char"/>
     <w:basedOn w:val="DefaultParagraphFont"/>
     <w:link w:val="Heading9"/>
@@ -5621,11 +6107,11 @@
     <w:semiHidden/>
     <w:rsid w:val="00A10FD9"/>
     <w:rPr>
-      <w:rFonts w:cstheme="majorBidi" w:eastAsiaTheme="majorEastAsia"/>
-      <w:color w:themeColor="text1" w:themeTint="D8" w:val="272727"/>
+      <w:rFonts w:eastAsiaTheme="majorEastAsia" w:cstheme="majorBidi"/>
+      <w:color w:val="272727" w:themeColor="text1" w:themeTint="D8"/>
     </w:rPr>
   </w:style>
-  <w:style w:styleId="BlockText" w:type="paragraph">
+  <w:style w:type="paragraph" w:styleId="BlockText">
     <w:name w:val="Block Text"/>
     <w:basedOn w:val="BodyText"/>
     <w:next w:val="BodyText"/>
@@ -5633,11 +6119,11 @@
     <w:unhideWhenUsed/>
     <w:qFormat/>
     <w:pPr>
-      <w:spacing w:after="100" w:before="100"/>
+      <w:spacing w:before="100" w:after="100"/>
       <w:ind w:firstLine="0" w:left="480" w:right="480"/>
     </w:pPr>
   </w:style>
-  <w:style w:styleId="FootnoteText" w:type="paragraph">
+  <w:style w:type="paragraph" w:styleId="FootnoteText">
     <w:name w:val="Footnote Text"/>
     <w:basedOn w:val="Normal"/>
     <w:next w:val="FootnoteText"/>
@@ -5645,7 +6131,7 @@
     <w:unhideWhenUsed/>
     <w:qFormat/>
   </w:style>
-  <w:style w:styleId="FootnoteBlockText" w:type="paragraph">
+  <w:style w:type="paragraph" w:styleId="FootnoteBlockText">
     <w:name w:val="Footnote Block Text"/>
     <w:basedOn w:val="FootnoteText"/>
     <w:next w:val="FootnoteText"/>
@@ -5653,28 +6139,26 @@
     <w:unhideWhenUsed/>
     <w:qFormat/>
     <w:pPr>
-      <w:spacing w:after="100" w:before="100"/>
+      <w:spacing w:before="100" w:after="100"/>
       <w:ind w:firstLine="0" w:left="480" w:right="480"/>
     </w:pPr>
   </w:style>
-  <w:style w:default="1" w:styleId="DefaultParagraphFont" w:type="character">
+  <w:style w:type="character" w:default="1" w:styleId="DefaultParagraphFont">
     <w:name w:val="Default Paragraph Font"/>
     <w:semiHidden/>
     <w:unhideWhenUsed/>
   </w:style>
-  <w:style w:default="1" w:styleId="Table" w:type="table">
+  <w:style w:type="table" w:default="1" w:styleId="Table">
     <w:name w:val="Table"/>
     <w:basedOn w:val="TableNormal"/>
-    <w:semiHidden/>
-    <w:unhideWhenUsed/>
     <w:qFormat/>
     <w:tblPr>
-      <w:tblInd w:type="dxa" w:w="0"/>
+      <w:tblInd w:w="0" w:type="dxa"/>
       <w:tblCellMar>
-        <w:top w:type="dxa" w:w="0"/>
-        <w:left w:type="dxa" w:w="108"/>
-        <w:bottom w:type="dxa" w:w="0"/>
-        <w:right w:type="dxa" w:w="108"/>
+        <w:top w:w="0" w:type="dxa"/>
+        <w:left w:w="108" w:type="dxa"/>
+        <w:bottom w:w="0" w:type="dxa"/>
+        <w:right w:w="108" w:type="dxa"/>
       </w:tblCellMar>
     </w:tblPr>
     <w:tblStylePr w:type="firstRow">
@@ -5686,7 +6170,7 @@
       </w:tcPr>
     </w:tblStylePr>
   </w:style>
-  <w:style w:customStyle="1" w:styleId="DefinitionTerm" w:type="paragraph">
+  <w:style w:type="paragraph" w:customStyle="1" w:styleId="DefinitionTerm">
     <w:name w:val="Definition Term"/>
     <w:basedOn w:val="Normal"/>
     <w:next w:val="Definition"/>
@@ -5699,49 +6183,49 @@
       <w:b/>
     </w:rPr>
   </w:style>
-  <w:style w:customStyle="1" w:styleId="Definition" w:type="paragraph">
+  <w:style w:type="paragraph" w:customStyle="1" w:styleId="Definition">
     <w:name w:val="Definition"/>
     <w:basedOn w:val="Normal"/>
   </w:style>
-  <w:style w:styleId="Caption" w:type="paragraph">
+  <w:style w:type="paragraph" w:styleId="Caption">
     <w:name w:val="Caption"/>
     <w:basedOn w:val="Normal"/>
     <w:link w:val="BodyTextChar"/>
     <w:pPr>
-      <w:spacing w:after="120" w:before="0"/>
+      <w:spacing w:before="0" w:after="120"/>
     </w:pPr>
     <w:rPr>
       <w:i/>
     </w:rPr>
   </w:style>
-  <w:style w:customStyle="1" w:styleId="TableCaption" w:type="paragraph">
+  <w:style w:type="paragraph" w:customStyle="1" w:styleId="TableCaption">
     <w:name w:val="Table Caption"/>
     <w:basedOn w:val="Caption"/>
     <w:pPr>
       <w:keepNext/>
     </w:pPr>
   </w:style>
-  <w:style w:customStyle="1" w:styleId="ImageCaption" w:type="paragraph">
+  <w:style w:type="paragraph" w:customStyle="1" w:styleId="ImageCaption">
     <w:name w:val="Image Caption"/>
     <w:basedOn w:val="Caption"/>
   </w:style>
-  <w:style w:customStyle="1" w:styleId="Figure" w:type="paragraph">
+  <w:style w:type="paragraph" w:customStyle="1" w:styleId="Figure">
     <w:name w:val="Figure"/>
     <w:basedOn w:val="Normal"/>
   </w:style>
-  <w:style w:customStyle="1" w:styleId="CaptionedFigure" w:type="paragraph">
+  <w:style w:type="paragraph" w:customStyle="1" w:styleId="CaptionedFigure">
     <w:name w:val="Captioned Figure"/>
     <w:basedOn w:val="Figure"/>
     <w:pPr>
       <w:keepNext/>
     </w:pPr>
   </w:style>
-  <w:style w:customStyle="1" w:styleId="BodyTextChar" w:type="character">
+  <w:style w:type="character" w:customStyle="1" w:styleId="BodyTextChar">
     <w:name w:val="Body Text Char"/>
     <w:basedOn w:val="DefaultParagraphFont"/>
     <w:link w:val="BodyText"/>
   </w:style>
-  <w:style w:customStyle="1" w:styleId="VerbatimChar" w:type="character">
+  <w:style w:type="character" w:customStyle="1" w:styleId="VerbatimChar">
     <w:name w:val="Verbatim Char"/>
     <w:basedOn w:val="BodyTextChar"/>
     <w:rPr>
@@ -5749,25 +6233,25 @@
       <w:sz w:val="22"/>
     </w:rPr>
   </w:style>
-  <w:style w:customStyle="1" w:styleId="SectionNumber" w:type="character">
+  <w:style w:type="character" w:customStyle="1" w:styleId="SectionNumber">
     <w:name w:val="Section Number"/>
     <w:basedOn w:val="BodyTextChar"/>
   </w:style>
-  <w:style w:styleId="FootnoteReference" w:type="character">
+  <w:style w:type="character" w:styleId="FootnoteReference">
     <w:name w:val="Footnote Reference"/>
     <w:basedOn w:val="BodyTextChar"/>
     <w:rPr>
       <w:vertAlign w:val="superscript"/>
     </w:rPr>
   </w:style>
-  <w:style w:styleId="Hyperlink" w:type="character">
+  <w:style w:type="character" w:styleId="Hyperlink">
     <w:name w:val="Hyperlink"/>
     <w:basedOn w:val="BodyTextChar"/>
     <w:rPr>
-      <w:color w:themeColor="accent1" w:val="4F81BD"/>
+      <w:color w:val="4F81BD" w:themeColor="accent1"/>
     </w:rPr>
   </w:style>
-  <w:style w:styleId="TOCHeading" w:type="paragraph">
+  <w:style w:type="paragraph" w:styleId="TOCHeading">
     <w:name w:val="TOC Heading"/>
     <w:basedOn w:val="Heading1"/>
     <w:next w:val="BodyText"/>
@@ -5779,10 +6263,10 @@
       <w:outlineLvl w:val="9"/>
     </w:pPr>
     <w:rPr>
-      <w:rFonts w:asciiTheme="majorHAnsi" w:cstheme="majorBidi" w:eastAsiaTheme="majorEastAsia" w:hAnsiTheme="majorHAnsi"/>
+      <w:rFonts w:asciiTheme="majorHAnsi" w:eastAsiaTheme="majorEastAsia" w:hAnsiTheme="majorHAnsi" w:cstheme="majorBidi"/>
       <w:b w:val="0"/>
       <w:bCs w:val="0"/>
-      <w:color w:themeColor="accent1" w:themeShade="BF" w:val="365F91"/>
+      <w:color w:val="365F91" w:themeColor="accent1" w:themeShade="BF"/>
     </w:rPr>
   </w:style>
   <w:style w:type="paragraph" w:customStyle="1" w:styleId="SourceCode">

</xml_diff>